<commit_message>
defense prep: single 18-slide deck, tighter speech (~9 min), Q&A doc
- Revert backup slides into single 18-slide file (slides 14-18 after "Спасибо")
- Bake in slide 7 fix: нефть "менее 2,4 %" (matches pie chart)
- Rewrite speech tighter for strict 10-min limit (~742 words, ~8-9 min)
- Add Вопросы_и_ответы_ГЭК: 20 likely commission questions with answers

https://claude.ai/code/session_019hNMUj3P61dTB8aYHXMjHP
</commit_message>
<xml_diff>
--- a/thesis/vkr_final/Речь_к_защите_Байханов_2026.docx
+++ b/thesis/vkr_final/Речь_к_защите_Байханов_2026.docx
@@ -13,7 +13,7 @@
         </w:rPr>
         <w:t>Текст выступления к защите ВКР</w:t>
         <w:br/>
-        <w:t>(регламент ~10 минут)</w:t>
+        <w:t>(строгий регламент 10 минут — цель ~9 минут с запасом)</w:t>
       </w:r>
     </w:p>
     <w:p>
@@ -35,7 +35,7 @@
         <w:jc w:val="both"/>
       </w:pPr>
       <w:r>
-        <w:t>Уважаемый председатель, уважаемые члены государственной экзаменационной комиссии! Вашему вниманию представляется выпускная квалификационная работа на тему «Автоматическое детектирование нефтяных разливов в акваториях арктических портов по данным спутниковой радиолокационной съёмки». Работа выполнена под научным руководством кандидата технических наук, доцента Митько Арсения Валерьевича.</w:t>
+        <w:t>Уважаемый председатель, уважаемые члены государственной экзаменационной комиссии! Вашему вниманию представляется выпускная квалификационная работа на тему «Автоматическое детектирование нефтяных разливов в акваториях арктических портов по данным спутниковой радиолокационной съёмки». Научный руководитель — кандидат технических наук, доцент Митько Арсений Валерьевич.</w:t>
       </w:r>
     </w:p>
     <w:p>
@@ -57,7 +57,7 @@
         <w:jc w:val="both"/>
       </w:pPr>
       <w:r>
-        <w:t>Загрязнение нефтью остаётся одной из главных угроз экосистемам Арктики. Ежегодно в Мировой океан попадает более семисот тысяч тонн углеводородов, и доля Арктики устойчиво растёт из-за развития судоходства по Северному морскому пути и расширения шельфовой инфраструктуры. При этом в арктических условиях нефть разлагается в пять–десять раз медленнее, что приводит к долговременному загрязнению.</w:t>
+        <w:t>Нефтяное загрязнение — одна из главных угроз экосистемам Арктики. Ежегодно в океан попадает более семисот тысяч тонн углеводородов, а в холодных водах нефть разлагается в пять–десять раз медленнее. При этом более восьмидесяти процентов времени над портами держатся облачность и полярная ночь — оптические спутники бесполезны. Всепогодное решение — радар Sentinel-1.</w:t>
       </w:r>
     </w:p>
     <w:p>
@@ -67,7 +67,7 @@
         <w:jc w:val="both"/>
       </w:pPr>
       <w:r>
-        <w:t>Более восьмидесяти процентов времени над арктическими портами держится облачность и полярная ночь, поэтому оптические спутники здесь почти бесполезны. Всепогодным и круглосуточным инструментом служит радиолокационная съёмка Sentinel-1. Однако у радара есть принципиальная проблема: начальные формы льда, биогенные плёнки и зоны штиля создают на снимках тёмные пятна, неотличимые от нефти по простой яркости. Доля ложных срабатываний у классических методов достигает семидесяти процентов. Справа — реальный разлив мазута в Кольском заливе в августе 2024 года, который наша модель уверенно выделяет.</w:t>
+        <w:t>Но у радара есть ключевая проблема: лёд, биоплёнки и штиль дают тёмные пятна, неотличимые от нефти по яркости. У классических методов до семидесяти процентов ложных срабатываний. Справа — разлив мазута в Кольском заливе в августе 2024 года, который модель уверенно выделяет.</w:t>
       </w:r>
     </w:p>
     <w:p>
@@ -89,7 +89,7 @@
         <w:jc w:val="both"/>
       </w:pPr>
       <w:r>
-        <w:t>Целью работы является автоматизация процесса детектирования нефтяных разливов в акваториях арктических портов по данным Sentinel-1 за счёт разработки нейросетевой трёхклассовой модели семантической сегментации, обеспечивающей значение F1-меры для класса «нефть» не ниже ноль целых восьмидесяти пяти сотых.</w:t>
+        <w:t>Цель работы — автоматизация детектирования нефтяных разливов по данным Sentinel-1 за счёт трёхклассовой нейросетевой модели сегментации с F1-мерой для класса «нефть» не ниже ноль целых восьмидесяти пяти сотых.</w:t>
       </w:r>
     </w:p>
     <w:p>
@@ -99,7 +99,7 @@
         <w:jc w:val="both"/>
       </w:pPr>
       <w:r>
-        <w:t>Обращаю внимание: по рекомендации комиссии цель сформулирована именно как автоматизация процесса, а не создание системы. Для достижения цели поставлены четыре задачи: выявить ограничения существующих методов и обосновать выбор архитектуры; разработать методику формирования датасета и обучить модель; реализовать программный прототип; и провести экспериментальную оценку с сравнительным анализом.</w:t>
+        <w:t>Для её достижения поставлены четыре задачи: выявить ограничения существующих методов и обосновать архитектуру; разработать методику датасета и обучить модель; реализовать программный прототип; провести экспериментальную оценку и сравнительный анализ.</w:t>
       </w:r>
     </w:p>
     <w:p>
@@ -121,7 +121,7 @@
         <w:jc w:val="both"/>
       </w:pPr>
       <w:r>
-        <w:t>Научная новизна работы складывается из трёх элементов. Первое и главное — переход от бинарной схемы «нефть — фон», которая используется практически во всех существующих публикациях, к трёхклассовой схеме: вода, нефть и отдельный класс «лёд плюс суша». Вынося начальные формы льда в самостоятельный класс, мы напрямую боремся с главным источником ложных тревог в Арктике.</w:t>
+        <w:t>Новизна — в трёх элементах. Главное — переход от бинарной схемы «нефть — фон», принятой почти во всех работах, к трёхклассовой: вода, нефть и отдельный класс «лёд плюс суша». Вынося лёд в отдельный класс, мы напрямую боремся с главным источником ложных тревог.</w:t>
       </w:r>
     </w:p>
     <w:p>
@@ -131,7 +131,7 @@
         <w:jc w:val="both"/>
       </w:pPr>
       <w:r>
-        <w:t>Второе — методика формирования арктического подмножества данных: полигональная разметка снимков Кольского залива в QGIS с привлечением метеорологических данных реанализа ERA5 и навигационных данных AIS. Третье — архитектура DeepLabV3+ с энкодером ResNet-50 и блоками внимания scSE адаптирована к одноканальным радиолокационным данным, а дисбаланс классов устранён комбинированной функцией потерь Dice-BCE с весами классов.</w:t>
+        <w:t>Второе — методика арктического датасета: разметка Кольского залива в QGIS с привлечением метеоданных ERA5 и судовых данных AIS. Третье — архитектура DeepLabV3+ с блоками внимания scSE, адаптированная к одноканальным радарным данным, и взвешенная функция потерь Dice-BCE против дисбаланса.</w:t>
       </w:r>
     </w:p>
     <w:p>
@@ -153,17 +153,7 @@
         <w:jc w:val="both"/>
       </w:pPr>
       <w:r>
-        <w:t>Прежде чем перейти к решению, я систематизировал существующие методы. В таблице — пять характерных подходов: пороговый метод Оцу, классическая U-Net Krestenitis, связка текстурных признаков GLCM с CNN и пороговый метод, принятый в практике. Все они объединены двумя общими ограничениями: они работают по бинарной схеме и не выделяют лёд в отдельный класс.</w:t>
-      </w:r>
-    </w:p>
-    <w:p>
-      <w:pPr>
-        <w:spacing w:after="80"/>
-        <w:ind w:firstLine="567"/>
-        <w:jc w:val="both"/>
-      </w:pPr>
-      <w:r>
-        <w:t>Именно это и порождает до семидесяти процентов ложных тревог в арктических акваториях. Наша работа, в последней строке, — единственная, где сочетаются трёхклассовость, явный учёт ледовых ложных целей и работа с арктическими данными.</w:t>
+        <w:t>В таблице систематизированы характерные подходы: пороговый метод Оцу, U-Net Krestenitis, связка GLCM с CNN и практический порог. Все они бинарные и не выделяют лёд в отдельный класс — отсюда до семидесяти процентов ложных тревог. Наша работа в нижней строке — единственная, где сочетаются трёхклассовость, учёт ледовых ложных целей и арктические данные.</w:t>
       </w:r>
     </w:p>
     <w:p>
@@ -185,7 +175,7 @@
         <w:jc w:val="both"/>
       </w:pPr>
       <w:r>
-        <w:t>Система реализована как трёхэтапный модульный конвейер. Первый этап — предобработка в среде ESA SNAP: шесть последовательных шагов, включая коррекцию орбиты, удаление теплового шума, радиометрическую калибровку, фильтрацию спекл-шума фильтром Ли семь на семь, геометрическую коррекцию и перевод в децибельную шкалу.</w:t>
+        <w:t>Решение — трёхэтапный модульный конвейер. Первый этап — предобработка в ESA SNAP: коррекция орбиты, удаление шума, калибровка, фильтр спекла, геокоррекция и перевод в децибелы. Второй — нейросетевая сегментация на три класса. Третий — верификация аномалий по морфологии пятна и контексту с учётом метеоданных и AIS.</w:t>
       </w:r>
     </w:p>
     <w:p>
@@ -195,7 +185,7 @@
         <w:jc w:val="both"/>
       </w:pPr>
       <w:r>
-        <w:t>Второй этап — нейросетевая сегментация на три класса. Третий — верификация обнаруженных аномалий по морфологии пятна и пространственному контексту с привлечением метеоданных и AIS. Обработка одной радиолокационной сцены занимает шестьдесят пять секунд. Всё решение написано на Python с использованием PyTorch, выполняется на видеокарте NVIDIA RTX 3090, код опубликован в открытом доступе.</w:t>
+        <w:t>Обработка одной сцены — шестьдесят пять секунд. Реализация на Python и PyTorch, вычисления на NVIDIA RTX 3090, код в открытом доступе.</w:t>
       </w:r>
     </w:p>
     <w:p>
@@ -217,7 +207,7 @@
         <w:jc w:val="both"/>
       </w:pPr>
       <w:r>
-        <w:t>Обучающий датасет объединяет тысячу сто двадцать пять размеченных сцен: тысяча сто двенадцать из открытого набора MKLab Krestenitis и тринадцать собственных сцен Кольского залива, размеченных мной вручную. После нарезки на фрагменты двести пятьдесят шесть на двести пятьдесят шесть пикселей получено четыре тысячи сто двадцать восемь тайлов, разделённых на обучающую, валидационную и тестовую выборки в пропорции семьдесят, двадцать, десять на уровне сцен.</w:t>
+        <w:t>Датасет объединяет тысячу сто двадцать пять сцен: тысяча сто двенадцать из открытого набора MKLab Krestenitis и тринадцать собственных сцен Кольского залива, размеченных вручную. После нарезки — четыре тысячи сто двадцать восемь тайлов, деление семьдесят, двадцать, десять на уровне сцен.</w:t>
       </w:r>
     </w:p>
     <w:p>
@@ -227,7 +217,7 @@
         <w:jc w:val="both"/>
       </w:pPr>
       <w:r>
-        <w:t>Главная сложность обучения — сильный дисбаланс: пиксели нефти составляют менее одного процента, что видно на круговой диаграмме слева. Эта проблема решена назначением классам весов в функции потерь — вес класса «нефть» повышен до девяти целых восьми десятых. Графики справа показывают устойчивую сходимость: лучшее mIoU ноль целых восемьдесят четыре достигнуто на семьдесят восьмой эпохе без признаков переобучения.</w:t>
+        <w:t>Главная сложность — дисбаланс: пиксели нефти составляют менее двух с половиной процентов. Решение — весовые коэффициенты в функции потерь, вес класса «нефть» повышен до девяти целых восьми десятых. Обучение сошлось устойчиво: лучшее mIoU ноль целых восемьдесят четыре на семьдесят восьмой эпохе, без переобучения.</w:t>
       </w:r>
     </w:p>
     <w:p>
@@ -249,7 +239,7 @@
         <w:jc w:val="both"/>
       </w:pPr>
       <w:r>
-        <w:t>На отложенной тестовой выборке Кольского залива из четырёхсот двенадцати тайлов модель достигла F1-меры ноль целых восемьдесят девять сотых для класса «нефть», среднего mIoU ноль целых восемьдесят две сотых и общей точности девяносто пять и восемь десятых процента. Таким образом, целевой критерий ноль целых восемьдесят пять сотых выполнен.</w:t>
+        <w:t>На тестовой выборке модель достигла F1-меры ноль целых восемьдесят девять для класса «нефть», mIoU ноль целых восемьдесят два и общей точности девяносто пять и восемь десятых процента — целевой критерий выполнен.</w:t>
       </w:r>
     </w:p>
     <w:p>
@@ -259,7 +249,7 @@
         <w:jc w:val="both"/>
       </w:pPr>
       <w:r>
-        <w:t>Матрица ошибок справа показывает, что все три класса распознаются устойчиво: вода — девяносто шесть и две десятых процента, лёд плюс суша — девяносто шесть процентов. Основной тип ошибки — отнесение восьми и четырёх десятых процента пикселей нефти к классу «лёд плюс суша»; это объясняется физически схожими тёмными сигнатурами.</w:t>
+        <w:t>Матрица ошибок показывает устойчивое распознавание всех трёх классов: вода и лёд плюс суша — около девяноста шести процентов. Основная ошибка — восемь и четыре десятых процента пикселей нефти уходят в класс «лёд плюс суша» из-за физически схожих тёмных сигнатур.</w:t>
       </w:r>
     </w:p>
     <w:p>
@@ -281,17 +271,7 @@
         <w:jc w:val="both"/>
       </w:pPr>
       <w:r>
-        <w:t>Для объективности я сравнил модель с четырьмя методами-аналогами по F1-мере класса «нефть». Наша модель DeepLabV3+ с блоками scSE показала ноль целых восемьдесят девять сотых — это лучший результат. По сравнению с пороговым методом Оцу прирост составил ноль целых восемнадцать сотых.</w:t>
-      </w:r>
-    </w:p>
-    <w:p>
-      <w:pPr>
-        <w:spacing w:after="80"/>
-        <w:ind w:firstLine="567"/>
-        <w:jc w:val="both"/>
-      </w:pPr>
-      <w:r>
-        <w:t>Модель превзошла все четыре альтернативных метода по всем метрикам. Прирост обеспечивается именно сочетанием механизма внимания scSE и трёхклассовой схемы сегментации.</w:t>
+        <w:t>По F1-мере класса «нефть» наша модель показала ноль целых восемьдесят девять — лучший результат, с приростом ноль целых восемнадцать к пороговому методу Оцу. Модель превзошла все четыре аналога по всем метрикам; прирост обеспечен сочетанием внимания scSE и трёхклассовой схемы.</w:t>
       </w:r>
     </w:p>
     <w:p>
@@ -313,17 +293,7 @@
         <w:jc w:val="both"/>
       </w:pPr>
       <w:r>
-        <w:t>Чтобы проверить, насколько методика обобщается, я испытал её на акваториях ещё двух арктических портов без дообучения. Наблюдается закономерное снижение качества при удалении от региона обучения: Кольский залив — ноль целых восемьдесят девять, Варандей — ноль целых восемьдесят четыре, Сабетта — ноль целых семьдесят шесть.</w:t>
-      </w:r>
-    </w:p>
-    <w:p>
-      <w:pPr>
-        <w:spacing w:after="80"/>
-        <w:ind w:firstLine="567"/>
-        <w:jc w:val="both"/>
-      </w:pPr>
-      <w:r>
-        <w:t>Важно, что даже при переносе качество остаётся приемлемым, а доля ложных срабатываний растёт умеренно. Вывод: методика принципиально применима к новым акваториям, но для самых тяжёлых ледовых условий требуется целевое дообучение.</w:t>
+        <w:t>Методику я проверил ещё на двух портах без дообучения. Качество закономерно снижается с удалением от региона обучения: Кольский залив — ноль целых восемьдесят девять, Варандей — ноль целых восемьдесят четыре, Сабетта — ноль целых семьдесят шесть. Вывод: методика применима к новым акваториям, но для тяжёлых ледовых условий нужно целевое дообучение.</w:t>
       </w:r>
     </w:p>
     <w:p>
@@ -345,17 +315,7 @@
         <w:jc w:val="both"/>
       </w:pPr>
       <w:r>
-        <w:t>Качественный анализ позволил классифицировать типы ложных целей по акваториям. В Печенге преобладает безлёдный тип — ветровые тени и биогенные плёнки. В Варандее — сезонный первогодний дрейфующий лёд. В Сабетте, самой сложной акватории, — жировой и ниласовый лёд и припай.</w:t>
-      </w:r>
-    </w:p>
-    <w:p>
-      <w:pPr>
-        <w:spacing w:after="80"/>
-        <w:ind w:firstLine="567"/>
-        <w:jc w:val="both"/>
-      </w:pPr>
-      <w:r>
-        <w:t>На снимке справа, на примере Варандея, видно, как модель отделяет реальные тёмные зоны от ледовых ложных целей. Именно понимание физической природы этих помех и легло в основу трёхклассовой схемы.</w:t>
+        <w:t>Ложные цели классифицированы по акваториям: в Печенге — ветровые тени и биоплёнки, в Варандее — первогодний дрейфующий лёд, в Сабетте — жировой и ниласовый лёд и припай. Справа на примере Варандея видно, как модель отделяет реальные тёмные зоны от ледовых ложных целей. Понимание этой физики и легло в основу трёхклассовой схемы.</w:t>
       </w:r>
     </w:p>
     <w:p>
@@ -377,7 +337,7 @@
         <w:jc w:val="both"/>
       </w:pPr>
       <w:r>
-        <w:t>Подведу итог. Поставленная цель достигнута: критерий F1 не ниже ноль целых восемьдесят пять сотых выполнен с результатом ноль целых восемьдесят девять. Решены все четыре задачи: систематизированы ограничения существующих методов и обоснован выбор архитектуры; создан комбинированный датасет с оригинальной трёхклассовой разметкой; реализован программный прототип-конвейер, код опубликован в открытом доступе; экспериментально подтверждено превосходство над пороговыми и классическими методами.</w:t>
+        <w:t>Цель достигнута: F1 ноль целых восемьдесят девять при критерии не ниже ноль целых восемьдесят пять. Решены все четыре задачи: систематизированы методы, создан датасет с трёхклассовой разметкой, реализован прототип-конвейер с открытым кодом, экспериментально подтверждено превосходство над пороговыми и классическими методами.</w:t>
       </w:r>
     </w:p>
     <w:p>
@@ -387,7 +347,7 @@
         <w:jc w:val="both"/>
       </w:pPr>
       <w:r>
-        <w:t>Практическая значимость состоит в применимости решения в системах экологического мониторинга арктических портов — в интересах Росприроднадзора, МЧС, «Морспасслужбы» и мониторинга Северного морского пути.</w:t>
+        <w:t>Практическая значимость — применимость в системах экологического мониторинга арктических портов: Росприроднадзор, МЧС, «Морспасслужба» и мониторинг Северного морского пути.</w:t>
       </w:r>
     </w:p>
     <w:p>
@@ -430,7 +390,7 @@
         <w:spacing w:after="40"/>
       </w:pPr>
       <w:r>
-        <w:t>Слайды 1, 3, 9, 11 — по ~0,5–0,7 мин</w:t>
+        <w:t>Слайды 1, 3, 5, 9, 10, 11 — по ~0,5–0,6 мин</w:t>
       </w:r>
     </w:p>
     <w:p>
@@ -439,7 +399,7 @@
         <w:spacing w:after="40"/>
       </w:pPr>
       <w:r>
-        <w:t>Слайды 2, 4, 5, 6, 7, 8, 10, 12 — по ~0,8–1,1 мин</w:t>
+        <w:t>Слайды 2, 4, 6, 7, 8, 12 — по ~0,7–0,9 мин</w:t>
       </w:r>
     </w:p>
     <w:p>
@@ -457,7 +417,7 @@
         <w:spacing w:after="40"/>
       </w:pPr>
       <w:r>
-        <w:t>ИТОГО: ~10–11 минут в спокойном темпе</w:t>
+        <w:t>ИТОГО: ~8,5–9 минут в спокойном темпе (запас до регламента 10 минут)</w:t>
       </w:r>
     </w:p>
     <w:p>
@@ -466,7 +426,16 @@
         <w:spacing w:after="40"/>
       </w:pPr>
       <w:r>
-        <w:t>Резервные слайды — в отдельном файле «Презентация_Резерв» для ответов на вопросы комиссии (архитектура DeepLabV3+, функция потерь, предобработка SNAP, метрики, разбор матрицы ошибок)</w:t>
+        <w:t>Совет: говорить ровно, не частить; при нехватке времени сократить второй абзац слайдов 2 и 6 — они наименее критичны.</w:t>
+      </w:r>
+    </w:p>
+    <w:p>
+      <w:pPr>
+        <w:pStyle w:val="ListBullet"/>
+        <w:spacing w:after="40"/>
+      </w:pPr>
+      <w:r>
+        <w:t>Резервные слайды 14–18 (в том же файле, после «Спасибо») — для ответов на вопросы комиссии: архитектура DeepLabV3+, функция потерь, предобработка SNAP, метрики, разбор матрицы ошибок.</w:t>
       </w:r>
     </w:p>
     <w:sectPr>

</xml_diff>

<commit_message>
Smooth speech: rewrite slide-2 problem statement and add spoken bridge transitions between all slides
https://claude.ai/code/session_019hNMUj3P61dTB8aYHXMjHP
</commit_message>
<xml_diff>
--- a/thesis/vkr_final/Речь_к_защите_Байханов_2026.docx
+++ b/thesis/vkr_final/Речь_к_защите_Байханов_2026.docx
@@ -62,14 +62,28 @@
     <w:p>
       <w:pPr>
         <w:spacing w:before="80" w:after="40"/>
+        <w:ind w:firstLine="567"/>
+        <w:jc w:val="both"/>
       </w:pPr>
       <w:r>
         <w:rPr>
           <w:i/>
           <w:color w:val="B5331F"/>
-          <w:sz w:val="24"/>
+          <w:sz w:val="26"/>
         </w:rPr>
-        <w:t>[Перелистнуть → ] Слайд 2 — Актуальность</w:t>
+        <w:t>Начну с того, почему эта задача важна именно сейчас.</w:t>
+      </w:r>
+    </w:p>
+    <w:p>
+      <w:pPr>
+        <w:spacing w:before="0" w:after="40"/>
+      </w:pPr>
+      <w:r>
+        <w:rPr>
+          <w:color w:val="6B7280"/>
+          <w:sz w:val="20"/>
+        </w:rPr>
+        <w:t>[Перелистнуть → Слайд 2 — Актуальность]</w:t>
       </w:r>
     </w:p>
     <w:p>
@@ -90,7 +104,7 @@
           <w:color w:val="6B7280"/>
           <w:sz w:val="20"/>
         </w:rPr>
-        <w:t xml:space="preserve">  [~55 сек]</w:t>
+        <w:t xml:space="preserve">  [~60 сек]</w:t>
       </w:r>
     </w:p>
     <w:p>
@@ -110,20 +124,34 @@
         <w:jc w:val="both"/>
       </w:pPr>
       <w:r>
-        <w:t>Однако у радара принципиальная проблема: лёд, биоплёнки и штиль дают тёмные пятна, визуально неотличимые от нефти. В сентябре 2024 года разлив мазута при бункеровке танкера в Кольском заливе — именно такая задача. У классических методов до семидесяти процентов ложных срабатываний. Решение: нужна трёхклассовая нейросетевая модель.</w:t>
+        <w:t>Но у радиолокации есть принципиальное ограничение. На радарном снимке нефтяная плёнка выглядит как тёмное пятно — однако точно такие же тёмные пятна дают молодой лёд, биогенные плёнки и зоны штиля. Из-за этих ложных целей классические пороговые методы дают до семидесяти процентов ложных срабатываний. Наглядный пример — внизу слайда: разлив мазута при бункеровке танкера в Кольском заливе одиннадцатого сентября две тысячи двадцать четвёртого года; этот случай и стал отправной точкой моей работы. Чтобы надёжно отличать нефть от её ледовых двойников, нужна не бинарная, а трёхклассовая нейросетевая модель — её разработке и посвящена работа.</w:t>
       </w:r>
     </w:p>
     <w:p>
       <w:pPr>
         <w:spacing w:before="80" w:after="40"/>
+        <w:ind w:firstLine="567"/>
+        <w:jc w:val="both"/>
       </w:pPr>
       <w:r>
         <w:rPr>
           <w:i/>
           <w:color w:val="B5331F"/>
-          <w:sz w:val="24"/>
+          <w:sz w:val="26"/>
         </w:rPr>
-        <w:t>[Перелистнуть → ] Слайд 3 — Цель и задачи</w:t>
+        <w:t>Сформулированная проблема определила цель и задачи работы.</w:t>
+      </w:r>
+    </w:p>
+    <w:p>
+      <w:pPr>
+        <w:spacing w:before="0" w:after="40"/>
+      </w:pPr>
+      <w:r>
+        <w:rPr>
+          <w:color w:val="6B7280"/>
+          <w:sz w:val="20"/>
+        </w:rPr>
+        <w:t>[Перелистнуть → Слайд 3 — Цель и задачи]</w:t>
       </w:r>
     </w:p>
     <w:p>
@@ -160,14 +188,28 @@
     <w:p>
       <w:pPr>
         <w:spacing w:before="80" w:after="40"/>
+        <w:ind w:firstLine="567"/>
+        <w:jc w:val="both"/>
       </w:pPr>
       <w:r>
         <w:rPr>
           <w:i/>
           <w:color w:val="B5331F"/>
-          <w:sz w:val="24"/>
+          <w:sz w:val="26"/>
         </w:rPr>
-        <w:t>[Перелистнуть → ] Слайд 4 — Существующие методы</w:t>
+        <w:t>Чтобы обосновать выбор архитектуры, я сначала проанализировал существующие методы.</w:t>
+      </w:r>
+    </w:p>
+    <w:p>
+      <w:pPr>
+        <w:spacing w:before="0" w:after="40"/>
+      </w:pPr>
+      <w:r>
+        <w:rPr>
+          <w:color w:val="6B7280"/>
+          <w:sz w:val="20"/>
+        </w:rPr>
+        <w:t>[Перелистнуть → Слайд 4 — Существующие методы]</w:t>
       </w:r>
     </w:p>
     <w:p>
@@ -204,14 +246,28 @@
     <w:p>
       <w:pPr>
         <w:spacing w:before="80" w:after="40"/>
+        <w:ind w:firstLine="567"/>
+        <w:jc w:val="both"/>
       </w:pPr>
       <w:r>
         <w:rPr>
           <w:i/>
           <w:color w:val="B5331F"/>
-          <w:sz w:val="24"/>
+          <w:sz w:val="26"/>
         </w:rPr>
-        <w:t>[Перелистнуть → ] Слайд 5 — Конвейер обработки</w:t>
+        <w:t>Опираясь на эти выводы, я построил собственный конвейер обработки данных.</w:t>
+      </w:r>
+    </w:p>
+    <w:p>
+      <w:pPr>
+        <w:spacing w:before="0" w:after="40"/>
+      </w:pPr>
+      <w:r>
+        <w:rPr>
+          <w:color w:val="6B7280"/>
+          <w:sz w:val="20"/>
+        </w:rPr>
+        <w:t>[Перелистнуть → Слайд 5 — Конвейер обработки]</w:t>
       </w:r>
     </w:p>
     <w:p>
@@ -248,14 +304,28 @@
     <w:p>
       <w:pPr>
         <w:spacing w:before="80" w:after="40"/>
+        <w:ind w:firstLine="567"/>
+        <w:jc w:val="both"/>
       </w:pPr>
       <w:r>
         <w:rPr>
           <w:i/>
           <w:color w:val="B5331F"/>
-          <w:sz w:val="24"/>
+          <w:sz w:val="26"/>
         </w:rPr>
-        <w:t>[Перелистнуть → ] Слайд 6 — Датасет и обучение</w:t>
+        <w:t>Сердце конвейера — нейросеть, а её качество определяется данными, на которых она обучена.</w:t>
+      </w:r>
+    </w:p>
+    <w:p>
+      <w:pPr>
+        <w:spacing w:before="0" w:after="40"/>
+      </w:pPr>
+      <w:r>
+        <w:rPr>
+          <w:color w:val="6B7280"/>
+          <w:sz w:val="20"/>
+        </w:rPr>
+        <w:t>[Перелистнуть → Слайд 6 — Датасет и обучение]</w:t>
       </w:r>
     </w:p>
     <w:p>
@@ -302,14 +372,28 @@
     <w:p>
       <w:pPr>
         <w:spacing w:before="80" w:after="40"/>
+        <w:ind w:firstLine="567"/>
+        <w:jc w:val="both"/>
       </w:pPr>
       <w:r>
         <w:rPr>
           <w:i/>
           <w:color w:val="B5331F"/>
-          <w:sz w:val="24"/>
+          <w:sz w:val="26"/>
         </w:rPr>
-        <w:t>[Перелистнуть → ] Слайд 7 — Результаты</w:t>
+        <w:t>Теперь посмотрим, какого качества удалось достичь.</w:t>
+      </w:r>
+    </w:p>
+    <w:p>
+      <w:pPr>
+        <w:spacing w:before="0" w:after="40"/>
+      </w:pPr>
+      <w:r>
+        <w:rPr>
+          <w:color w:val="6B7280"/>
+          <w:sz w:val="20"/>
+        </w:rPr>
+        <w:t>[Перелистнуть → Слайд 7 — Результаты]</w:t>
       </w:r>
     </w:p>
     <w:p>
@@ -356,14 +440,28 @@
     <w:p>
       <w:pPr>
         <w:spacing w:before="80" w:after="40"/>
+        <w:ind w:firstLine="567"/>
+        <w:jc w:val="both"/>
       </w:pPr>
       <w:r>
         <w:rPr>
           <w:i/>
           <w:color w:val="B5331F"/>
-          <w:sz w:val="24"/>
+          <w:sz w:val="26"/>
         </w:rPr>
-        <w:t>[Перелистнуть → ] Слайд 8 — Сравнение</w:t>
+        <w:t>Чтобы оценить эти результаты объективно, сравню их с известными аналогами.</w:t>
+      </w:r>
+    </w:p>
+    <w:p>
+      <w:pPr>
+        <w:spacing w:before="0" w:after="40"/>
+      </w:pPr>
+      <w:r>
+        <w:rPr>
+          <w:color w:val="6B7280"/>
+          <w:sz w:val="20"/>
+        </w:rPr>
+        <w:t>[Перелистнуть → Слайд 8 — Сравнение]</w:t>
       </w:r>
     </w:p>
     <w:p>
@@ -400,14 +498,28 @@
     <w:p>
       <w:pPr>
         <w:spacing w:before="80" w:after="40"/>
+        <w:ind w:firstLine="567"/>
+        <w:jc w:val="both"/>
       </w:pPr>
       <w:r>
         <w:rPr>
           <w:i/>
           <w:color w:val="B5331F"/>
-          <w:sz w:val="24"/>
+          <w:sz w:val="26"/>
         </w:rPr>
-        <w:t>[Перелистнуть → ] Слайд 9 — Переносимость</w:t>
+        <w:t>Закономерно встаёт вопрос — насколько модель переносима на другие порты.</w:t>
+      </w:r>
+    </w:p>
+    <w:p>
+      <w:pPr>
+        <w:spacing w:before="0" w:after="40"/>
+      </w:pPr>
+      <w:r>
+        <w:rPr>
+          <w:color w:val="6B7280"/>
+          <w:sz w:val="20"/>
+        </w:rPr>
+        <w:t>[Перелистнуть → Слайд 9 — Переносимость]</w:t>
       </w:r>
     </w:p>
     <w:p>
@@ -444,14 +556,28 @@
     <w:p>
       <w:pPr>
         <w:spacing w:before="80" w:after="40"/>
+        <w:ind w:firstLine="567"/>
+        <w:jc w:val="both"/>
       </w:pPr>
       <w:r>
         <w:rPr>
           <w:i/>
           <w:color w:val="B5331F"/>
-          <w:sz w:val="24"/>
+          <w:sz w:val="26"/>
         </w:rPr>
-        <w:t>[Перелистнуть → ] Слайды 10–12 — Ложные цели по портам</w:t>
+        <w:t>Разберу конкретные ложные цели в каждом из портов — начну с Печенги.</w:t>
+      </w:r>
+    </w:p>
+    <w:p>
+      <w:pPr>
+        <w:spacing w:before="0" w:after="40"/>
+      </w:pPr>
+      <w:r>
+        <w:rPr>
+          <w:color w:val="6B7280"/>
+          <w:sz w:val="20"/>
+        </w:rPr>
+        <w:t>[Перелистнуть → Слайд 10 — Порт Печенга]</w:t>
       </w:r>
     </w:p>
     <w:p>
@@ -488,14 +614,28 @@
     <w:p>
       <w:pPr>
         <w:spacing w:before="80" w:after="40"/>
+        <w:ind w:firstLine="567"/>
+        <w:jc w:val="both"/>
       </w:pPr>
       <w:r>
         <w:rPr>
           <w:i/>
           <w:color w:val="B5331F"/>
-          <w:sz w:val="24"/>
+          <w:sz w:val="26"/>
         </w:rPr>
-        <w:t>[Перелистнуть → ] Слайд 11 — Терминал Варандей</w:t>
+        <w:t>Переходим севернее — терминал Варандей, где главная сложность уже ледовая.</w:t>
+      </w:r>
+    </w:p>
+    <w:p>
+      <w:pPr>
+        <w:spacing w:before="0" w:after="40"/>
+      </w:pPr>
+      <w:r>
+        <w:rPr>
+          <w:color w:val="6B7280"/>
+          <w:sz w:val="20"/>
+        </w:rPr>
+        <w:t>[Перелистнуть → Слайд 11 — Терминал Варандей]</w:t>
       </w:r>
     </w:p>
     <w:p>
@@ -532,14 +672,28 @@
     <w:p>
       <w:pPr>
         <w:spacing w:before="80" w:after="40"/>
+        <w:ind w:firstLine="567"/>
+        <w:jc w:val="both"/>
       </w:pPr>
       <w:r>
         <w:rPr>
           <w:i/>
           <w:color w:val="B5331F"/>
-          <w:sz w:val="24"/>
+          <w:sz w:val="26"/>
         </w:rPr>
-        <w:t>[Перелистнуть → ] Слайд 12 — Порт Сабетта</w:t>
+        <w:t>И самый трудный случай — порт Сабетта в Карском море.</w:t>
+      </w:r>
+    </w:p>
+    <w:p>
+      <w:pPr>
+        <w:spacing w:before="0" w:after="40"/>
+      </w:pPr>
+      <w:r>
+        <w:rPr>
+          <w:color w:val="6B7280"/>
+          <w:sz w:val="20"/>
+        </w:rPr>
+        <w:t>[Перелистнуть → Слайд 12 — Порт Сабетта]</w:t>
       </w:r>
     </w:p>
     <w:p>
@@ -576,14 +730,28 @@
     <w:p>
       <w:pPr>
         <w:spacing w:before="80" w:after="40"/>
+        <w:ind w:firstLine="567"/>
+        <w:jc w:val="both"/>
       </w:pPr>
       <w:r>
         <w:rPr>
           <w:i/>
           <w:color w:val="B5331F"/>
-          <w:sz w:val="24"/>
+          <w:sz w:val="26"/>
         </w:rPr>
-        <w:t>[Перелистнуть → ] Слайд 13 — Заключение</w:t>
+        <w:t>Перейду к итогам работы.</w:t>
+      </w:r>
+    </w:p>
+    <w:p>
+      <w:pPr>
+        <w:spacing w:before="0" w:after="40"/>
+      </w:pPr>
+      <w:r>
+        <w:rPr>
+          <w:color w:val="6B7280"/>
+          <w:sz w:val="20"/>
+        </w:rPr>
+        <w:t>[Перелистнуть → Слайд 13 — Заключение]</w:t>
       </w:r>
     </w:p>
     <w:p>
@@ -630,14 +798,28 @@
     <w:p>
       <w:pPr>
         <w:spacing w:before="80" w:after="40"/>
+        <w:ind w:firstLine="567"/>
+        <w:jc w:val="both"/>
       </w:pPr>
       <w:r>
         <w:rPr>
           <w:i/>
           <w:color w:val="B5331F"/>
-          <w:sz w:val="24"/>
+          <w:sz w:val="26"/>
         </w:rPr>
-        <w:t>[Перелистнуть → ] Последний слайд — Спасибо</w:t>
+        <w:t>На этом мой доклад завершён.</w:t>
+      </w:r>
+    </w:p>
+    <w:p>
+      <w:pPr>
+        <w:spacing w:before="0" w:after="40"/>
+      </w:pPr>
+      <w:r>
+        <w:rPr>
+          <w:color w:val="6B7280"/>
+          <w:sz w:val="20"/>
+        </w:rPr>
+        <w:t>[Перелистнуть → Последний слайд — Спасибо]</w:t>
       </w:r>
     </w:p>
     <w:p>
@@ -717,7 +899,7 @@
         <w:rPr>
           <w:sz w:val="24"/>
         </w:rPr>
-        <w:t>~55 сек</w:t>
+        <w:t>~60 сек</w:t>
       </w:r>
     </w:p>
     <w:p>
@@ -951,7 +1133,7 @@
         <w:rPr>
           <w:sz w:val="24"/>
         </w:rPr>
-        <w:t>~8 мин 05 сек  (запас ~1 мин 55 сек)</w:t>
+        <w:t>~8 мин 20 сек  (запас ~1 мин 40 сек)</w:t>
       </w:r>
     </w:p>
     <w:p/>
@@ -961,7 +1143,7 @@
         <w:spacing w:after="60"/>
       </w:pPr>
       <w:r>
-        <w:t>Обозначения [Перелистнуть →] — сигнал переключить слайд. Говорить спокойно, 110–120 слов/мин.</w:t>
+        <w:t>Красные фразы-связки проговаривают вслух — это плавный переход к следующему слайду; серая пометка [Перелистнуть → …] — момент переключить слайд. Темп 110–120 слов/мин.</w:t>
       </w:r>
     </w:p>
     <w:p>

</xml_diff>

<commit_message>
Simplify speech for committee + remove threshold row from methods table
- Slide 4: drop "Порог μ−1,5σ" row, rebalance layout
- Speech: plain-language wording for F1, MKLab/GLCM+CNN terms, results,
  comparison and port slides; clarify 13 own scenes vs 1112 open dataset;
  trim runtime to ~7 min 40 sec

https://claude.ai/code/session_019hNMUj3P61dTB8aYHXMjHP
</commit_message>
<xml_diff>
--- a/thesis/vkr_final/Речь_к_защите_Байханов_2026.docx
+++ b/thesis/vkr_final/Речь_к_защите_Байханов_2026.docx
@@ -172,7 +172,7 @@
           <w:color w:val="6B7280"/>
           <w:sz w:val="20"/>
         </w:rPr>
-        <w:t xml:space="preserve">  [~40 сек]</w:t>
+        <w:t xml:space="preserve">  [~35 сек]</w:t>
       </w:r>
     </w:p>
     <w:p>
@@ -182,7 +182,7 @@
         <w:jc w:val="both"/>
       </w:pPr>
       <w:r>
-        <w:t>Цель работы — автоматизация детектирования нефтяных разливов по данным Sentinel-1 за счёт разработки трёхклассовой нейросетевой модели семантической сегментации, адаптированной к условиям активного ледообразования и обеспечивающей F1-score для класса «нефть» не ниже ноль целых восьмидесяти пяти. Для достижения цели поставлены четыре задачи: выявить ограничения аналогов и обосновать архитектуру; разработать методику датасета и обучить модель; реализовать программный прототип; провести экспериментальную оценку.</w:t>
+        <w:t>Цель работы — автоматизировать обнаружение нефтяных разливов по снимкам Sentinel-1. Для этого нужна нейросетевая модель, которая делит снимок на три класса — вода, нефть и лёд с сушей — и обеспечивает точность обнаружения нефти, показатель F1, не ниже ноль целых восьмидесяти пяти. Для достижения цели поставлены четыре задачи: изучить недостатки существующих методов и обосновать выбор архитектуры; собрать и разметить данные и обучить модель; реализовать программу-прототип; и оценить качество на реальных данных.</w:t>
       </w:r>
     </w:p>
     <w:p>
@@ -230,7 +230,7 @@
           <w:color w:val="6B7280"/>
           <w:sz w:val="20"/>
         </w:rPr>
-        <w:t xml:space="preserve">  [~40 сек]</w:t>
+        <w:t xml:space="preserve">  [~35 сек]</w:t>
       </w:r>
     </w:p>
     <w:p>
@@ -240,7 +240,7 @@
         <w:jc w:val="both"/>
       </w:pPr>
       <w:r>
-        <w:t>В таблице систематизированы характерные подходы. Методы Оцу и U-Net Krestenitis, GLCM с CNN и адаптивный порог — все они бинарные и не выделяют лёд в отдельный класс. Именно это порождает до семидесяти процентов ложных тревог в арктических условиях. Наша работа, в нижней строке, — единственная, где сочетаются трёхклассовость, учёт ледовых ложных целей и работа с арктическими данными.</w:t>
+        <w:t>На слайде — таблица существующих подходов. Здесь и классический пороговый метод Оцу, и нейросети, например U-Net, и метод, анализирующий текстуру снимка, — в таблице он обозначен как GLCM плюс CNN. У всех у них один общий недостаток: они работают по схеме «нефть или не нефть» и не выделяют лёд в отдельный класс. Именно из-за этого в Арктике они дают до семидесяти процентов ложных тревог. Моя работа — нижняя строка таблицы — единственная, где есть сразу и три класса, и учёт ледовых ложных целей, и работа именно с арктическими данными.</w:t>
       </w:r>
     </w:p>
     <w:p>
@@ -298,7 +298,7 @@
         <w:jc w:val="both"/>
       </w:pPr>
       <w:r>
-        <w:t>Разработанная система реализована в виде трёхэтапного конвейера. Первый этап — предобработка в программном комплексе ESA SNAP: шесть шагов от уточнения орбиты до геометрической привязки к местности. Второй — нейросетевая сегментация на три класса с помощью DeepLabV3+. Третий — верификация обнаруженных аномалий по метеоданным реанализа ERA5 и навигационным данным AIS. Полный цикл занимает шестьдесят пять секунд на одну сцену Sentinel-1.</w:t>
+        <w:t>Вся система работает как конвейер из трёх этапов. Первый этап — подготовка снимка: очистка от помех и географическая привязка; всё выполняется в свободном комплексе ESA SNAP. Второй этап — сама нейросеть, она делит снимок на три класса. Третий этап — проверка найденных пятен по данным о погоде и о движении судов, чтобы отсеять ложные срабатывания. Полная обработка одного снимка занимает шестьдесят пять секунд.</w:t>
       </w:r>
     </w:p>
     <w:p>
@@ -346,7 +346,7 @@
           <w:color w:val="6B7280"/>
           <w:sz w:val="20"/>
         </w:rPr>
-        <w:t xml:space="preserve">  [~55 сек]</w:t>
+        <w:t xml:space="preserve">  [~45 сек]</w:t>
       </w:r>
     </w:p>
     <w:p>
@@ -356,7 +356,7 @@
         <w:jc w:val="both"/>
       </w:pPr>
       <w:r>
-        <w:t>Датасет объединяет тысячу сто двадцать пять сцен: тысяча сто двенадцать из открытого набора MKLab Krestenitis, переразмеченных в трёхклассовую схему, и тринадцать собственных сцен Кольского залива, размеченных вручную. После нарезки с перекрытием пятьдесят процентов — четыре тысячи сто двадцать восемь тайлов, деление по сценам семьдесят, двадцать, десять.</w:t>
+        <w:t>Теперь о данных, на которых обучалась модель. Всего использовано тысяча сто двадцать пять размеченных снимков. Из них тысяча сто двенадцать — это открытый, общедоступный набор данных; я переразметил его под свою трёхклассовую схему. А тринадцать снимков Кольского залива я собрал и разметил вручную сам — это арктическая, самая ценная часть данных. После нарезки снимков на небольшие фрагменты получилось четыре тысячи сто двадцать восемь обучающих образцов.</w:t>
       </w:r>
     </w:p>
     <w:p>
@@ -366,7 +366,7 @@
         <w:jc w:val="both"/>
       </w:pPr>
       <w:r>
-        <w:t>Главная сложность — дисбаланс: пиксели нефти составляют лишь 2,4 процента. Решение — взвешенная функция потерь Dice-BCE, вес класса «нефть» повышен до 9,8. Обучение методом AdamW: сто эпох, лучшее mIoU ноль целых восемьдесят четыре достигнуто на семьдесят восьмой эпохе без переобучения.</w:t>
+        <w:t>Главная сложность данных — сильный перекос: нефть занимает всего около двух процентов изображения. Чтобы модель не игнорировала такой редкий класс, я специально повысил его значимость при обучении. Технические детали обучения приведены на слайде.</w:t>
       </w:r>
     </w:p>
     <w:p>
@@ -414,7 +414,7 @@
           <w:color w:val="6B7280"/>
           <w:sz w:val="20"/>
         </w:rPr>
-        <w:t xml:space="preserve">  [~50 сек]</w:t>
+        <w:t xml:space="preserve">  [~40 сек]</w:t>
       </w:r>
     </w:p>
     <w:p>
@@ -424,7 +424,7 @@
         <w:jc w:val="both"/>
       </w:pPr>
       <w:r>
-        <w:t>На отложенной тестовой выборке Кольского залива — 412 тайлов — модель достигла: F1-score для класса «нефть» — ноль целых восемьдесят девять (Precision 0,91, Recall 0,87); среднее mIoU — ноль целых восемьдесят два; общая точность — девяносто пять и восемь десятых процента. Целевой критерий ноль целых восемьдесят пять — выполнен.</w:t>
+        <w:t>Перейдём к результатам. Главный показатель — точность обнаружения нефти, это метрика F1 — составил ноль целых восемьдесят девять при целевом уровне ноль целых восемьдесят пять. То есть цель работы достигнута. Общая точность модели — почти девяносто шесть процентов. Подробные цифры по всем классам и матрица ошибок представлены на слайде.</w:t>
       </w:r>
     </w:p>
     <w:p>
@@ -434,7 +434,7 @@
         <w:jc w:val="both"/>
       </w:pPr>
       <w:r>
-        <w:t>Матрица ошибок показывает устойчивое распознавание: вода — 96,2 процента, лёд и суша — 96,0. Основная ошибка — 8,4 процента пикселей нефти уходят в класс «лёд плюс суша»: это физически предсказуемо, так как молодой лёд и нефть имеют схожие сигнатуры обратного рассеяния.</w:t>
+        <w:t>Отмечу главное: основная — и при этом небольшая — ошибка возникает там, где модель путает нефть с молодым льдом. Это физически объяснимо: на радарном снимке они действительно очень похожи.</w:t>
       </w:r>
     </w:p>
     <w:p>
@@ -482,7 +482,7 @@
           <w:color w:val="6B7280"/>
           <w:sz w:val="20"/>
         </w:rPr>
-        <w:t xml:space="preserve">  [~35 сек]</w:t>
+        <w:t xml:space="preserve">  [~30 сек]</w:t>
       </w:r>
     </w:p>
     <w:p>
@@ -492,7 +492,7 @@
         <w:jc w:val="both"/>
       </w:pPr>
       <w:r>
-        <w:t>Сравнение с четырьмя альтернативными методами показало превосходство DeepLabV3+ по всем метрикам. Лучший из аналогов — U-Net Krestenitis с F1 ноль целых восемьдесят шесть. Наша модель — ноль целых восемьдесят девять; прирост девять процентных пунктов относительно порогового метода. Выигрыш обеспечивается сочетанием внимания scSE и трёхклассовой схемы.</w:t>
+        <w:t>Чтобы показать, что результат действительно сильный, я сравнил свою модель с четырьмя другими методами на одних и тех же данных. Сравнение приведено на слайде. По всем показателям моя модель оказалась лучше: ближайший конкурент дал ноль целых восемьдесят шесть, а моя модель — ноль целых восемьдесят девять. Главная причина выигрыша — именно трёхклассовая схема с отдельным классом льда.</w:t>
       </w:r>
     </w:p>
     <w:p>
@@ -550,7 +550,7 @@
         <w:jc w:val="both"/>
       </w:pPr>
       <w:r>
-        <w:t>Для оценки обобщаемости методика проверена на двух других портах без дообучения. На шести сценах Варандея F1 снизилась до 0,84, на пяти сценах Сабетты — до 0,76. Деградация закономерна: с удалением от Кольского залива растёт доля незнакомых ледовых типов. Вывод: методика принципиально применима, для тяжёлых ледовых условий нужно целевое дообучение.</w:t>
+        <w:t>Важный вопрос — будет ли модель работать в других портах, а не только там, где она обучалась. Я проверил её на двух новых портах без дополнительного обучения. В Варандее точность осталась высокой — ноль целых восемьдесят четыре; в Сабетте снизилась до ноль целых семьдесят шесть. Снижение закономерно: чем дальше порт, тем больше непривычных для модели типов льда. Вывод: подход рабочий, а для самых тяжёлых ледовых условий нужно небольшое дообучение на местных данных.</w:t>
       </w:r>
     </w:p>
     <w:p>
@@ -598,7 +598,7 @@
           <w:color w:val="6B7280"/>
           <w:sz w:val="20"/>
         </w:rPr>
-        <w:t xml:space="preserve">  [~15 сек]</w:t>
+        <w:t xml:space="preserve">  [~18 сек]</w:t>
       </w:r>
     </w:p>
     <w:p>
@@ -608,7 +608,7 @@
         <w:jc w:val="both"/>
       </w:pPr>
       <w:r>
-        <w:t>Безлёдная акватория Баренцева моря. Главные ложные цели — ветровые тени при штиле и биогенные плёнки. На снимке видно, как модель правильно отделяет их от нефтяного пятна.</w:t>
+        <w:t>Порт Печенга, Баренцево море — льда здесь почти нет. На снимке показаны два главных «обманщика» радара: тёмные пятна от затишья ветра и плёнки от водорослей. Модель правильно распознала их как не-нефть и не подняла ложную тревогу.</w:t>
       </w:r>
     </w:p>
     <w:p>
@@ -656,7 +656,7 @@
           <w:color w:val="6B7280"/>
           <w:sz w:val="20"/>
         </w:rPr>
-        <w:t xml:space="preserve">  [~15 сек]</w:t>
+        <w:t xml:space="preserve">  [~18 сек]</w:t>
       </w:r>
     </w:p>
     <w:p>
@@ -666,7 +666,7 @@
         <w:jc w:val="both"/>
       </w:pPr>
       <w:r>
-        <w:t>Печорское море, сезонный первогодний дрейфующий лёд. При бинарной классификации он неотличим от нефти. Трёхклассовая схема явно разделяет их.</w:t>
+        <w:t>Терминал Варандей, Печорское море. Здесь главная трудность — дрейфующий молодой лёд. Обычный, бинарный метод принял бы его за нефть. На снимке видно, как трёхклассовая модель чётко отделяет лёд от возможного нефтяного пятна.</w:t>
       </w:r>
     </w:p>
     <w:p>
@@ -714,7 +714,7 @@
           <w:color w:val="6B7280"/>
           <w:sz w:val="20"/>
         </w:rPr>
-        <w:t xml:space="preserve">  [~15 сек]</w:t>
+        <w:t xml:space="preserve">  [~18 сек]</w:t>
       </w:r>
     </w:p>
     <w:p>
@@ -724,7 +724,7 @@
         <w:jc w:val="both"/>
       </w:pPr>
       <w:r>
-        <w:t>Самая сложная акватория: Обская губа Карского моря, жировой и ниласовый лёд, припай. Эти типы льда слабо представлены в обучении — отсюда снижение F1 до 0,76 при переносе без дообучения.</w:t>
+        <w:t>Порт Сабетта, Карское море — самая сложная акватория. Здесь молодой жировой и ниласовый лёд, припай — это редкие типы льда, которых почти не было в обучающих данных. Поэтому здесь точность ниже — ноль целых семьдесят шесть. На снимке видно, где модель работает уверенно, а где возникают сложности.</w:t>
       </w:r>
     </w:p>
     <w:p>
@@ -772,7 +772,7 @@
           <w:color w:val="6B7280"/>
           <w:sz w:val="20"/>
         </w:rPr>
-        <w:t xml:space="preserve">  [~50 сек]</w:t>
+        <w:t xml:space="preserve">  [~45 сек]</w:t>
       </w:r>
     </w:p>
     <w:p>
@@ -782,7 +782,7 @@
         <w:jc w:val="both"/>
       </w:pPr>
       <w:r>
-        <w:t>Подведу итог. Поставленная цель достигнута: F1-score 0,89 при критерии не ниже 0,85. Решены все четыре задачи: систематизированы ограничения методов и обоснован выбор DeepLabV3+ со scSE; сформирован датасет из 1125 сцен с трёхклассовой разметкой; реализован прототип-конвейер обработки SAR-сцен; экспериментально подтверждено превосходство над аналогами и проверена переносимость на другие арктические акватории.</w:t>
+        <w:t>Подведу итог. Цель работы достигнута: точность обнаружения нефти — ноль целых восемьдесят девять при требуемых ноль целых восемьдесят пять. Все четыре задачи решены: разобраны недостатки существующих методов и обоснован выбор модели; собран и размечен датасет; создан программа-прототип, обрабатывающий снимок за минуту; и на реальных данных доказано, что модель точнее аналогов и переносима на другие арктические порты.</w:t>
       </w:r>
     </w:p>
     <w:p>
@@ -792,7 +792,7 @@
         <w:jc w:val="both"/>
       </w:pPr>
       <w:r>
-        <w:t>Практическая значимость: разработанный прототип применим в составе оперативных систем экологического мониторинга арктических портов — в интересах Росприроднадзора, МЧС России, «Морспасслужбы» и мониторинга Северного морского пути.</w:t>
+        <w:t>Практическая значимость в том, что прототип можно применять для экологического мониторинга арктических портов — в интересах Росприроднадзора, МЧС России, Морспасслужбы и контроля Северного морского пути.</w:t>
       </w:r>
     </w:p>
     <w:p>
@@ -917,7 +917,7 @@
         <w:rPr>
           <w:sz w:val="24"/>
         </w:rPr>
-        <w:t>~40 сек</w:t>
+        <w:t>~35 сек</w:t>
       </w:r>
     </w:p>
     <w:p>
@@ -935,7 +935,7 @@
         <w:rPr>
           <w:sz w:val="24"/>
         </w:rPr>
-        <w:t>~40 сек</w:t>
+        <w:t>~35 сек</w:t>
       </w:r>
     </w:p>
     <w:p>
@@ -971,7 +971,7 @@
         <w:rPr>
           <w:sz w:val="24"/>
         </w:rPr>
-        <w:t>~55 сек</w:t>
+        <w:t>~45 сек</w:t>
       </w:r>
     </w:p>
     <w:p>
@@ -989,7 +989,7 @@
         <w:rPr>
           <w:sz w:val="24"/>
         </w:rPr>
-        <w:t>~50 сек</w:t>
+        <w:t>~40 сек</w:t>
       </w:r>
     </w:p>
     <w:p>
@@ -1007,7 +1007,7 @@
         <w:rPr>
           <w:sz w:val="24"/>
         </w:rPr>
-        <w:t>~35 сек</w:t>
+        <w:t>~30 сек</w:t>
       </w:r>
     </w:p>
     <w:p>
@@ -1043,7 +1043,7 @@
         <w:rPr>
           <w:sz w:val="24"/>
         </w:rPr>
-        <w:t>~15 сек</w:t>
+        <w:t>~18 сек</w:t>
       </w:r>
     </w:p>
     <w:p>
@@ -1061,7 +1061,7 @@
         <w:rPr>
           <w:sz w:val="24"/>
         </w:rPr>
-        <w:t>~15 сек</w:t>
+        <w:t>~18 сек</w:t>
       </w:r>
     </w:p>
     <w:p>
@@ -1079,7 +1079,7 @@
         <w:rPr>
           <w:sz w:val="24"/>
         </w:rPr>
-        <w:t>~15 сек</w:t>
+        <w:t>~18 сек</w:t>
       </w:r>
     </w:p>
     <w:p>
@@ -1097,7 +1097,7 @@
         <w:rPr>
           <w:sz w:val="24"/>
         </w:rPr>
-        <w:t>~50 сек</w:t>
+        <w:t>~45 сек</w:t>
       </w:r>
     </w:p>
     <w:p>
@@ -1133,7 +1133,7 @@
         <w:rPr>
           <w:sz w:val="24"/>
         </w:rPr>
-        <w:t>~8 мин 20 сек  (запас ~1 мин 40 сек)</w:t>
+        <w:t>~7 мин 40 сек  (запас ~2 мин 20 сек)</w:t>
       </w:r>
     </w:p>
     <w:p/>

</xml_diff>

<commit_message>
Add backup slide scripts (В.1–В.4) to speech doc with plain-language explanations
https://claude.ai/code/session_019hNMUj3P61dTB8aYHXMjHP
</commit_message>
<xml_diff>
--- a/thesis/vkr_final/Речь_к_защите_Байханов_2026.docx
+++ b/thesis/vkr_final/Речь_к_защите_Байханов_2026.docx
@@ -855,6 +855,163 @@
     </w:p>
     <w:p>
       <w:pPr>
+        <w:spacing w:before="320"/>
+      </w:pPr>
+      <w:r>
+        <w:rPr>
+          <w:b/>
+          <w:color w:val="1E40AF"/>
+          <w:sz w:val="26"/>
+        </w:rPr>
+        <w:t>РЕЗЕРВНЫЕ СЛАЙДЫ — открывать только при вопросах комиссии</w:t>
+      </w:r>
+    </w:p>
+    <w:p>
+      <w:r>
+        <w:rPr>
+          <w:i/>
+          <w:color w:val="6B7280"/>
+          <w:sz w:val="22"/>
+        </w:rPr>
+        <w:t>Эти слайды не показывают во время доклада. Открыть — только если комиссия спросит о соответствующей теме.</w:t>
+      </w:r>
+    </w:p>
+    <w:p>
+      <w:pPr>
+        <w:spacing w:before="240" w:after="40"/>
+      </w:pPr>
+      <w:r>
+        <w:rPr>
+          <w:b/>
+          <w:color w:val="1E40AF"/>
+          <w:sz w:val="24"/>
+        </w:rPr>
+        <w:t>СЛАЙД В.1. АРХИТЕКТУРА: DEEPLABV3+ С RESNET-50</w:t>
+      </w:r>
+      <w:r>
+        <w:rPr>
+          <w:i/>
+          <w:color w:val="6B7280"/>
+          <w:sz w:val="20"/>
+        </w:rPr>
+        <w:t xml:space="preserve">  [(при вопросе про модель)]</w:t>
+      </w:r>
+    </w:p>
+    <w:p>
+      <w:pPr>
+        <w:spacing w:after="80"/>
+        <w:ind w:firstLine="567"/>
+        <w:jc w:val="both"/>
+      </w:pPr>
+      <w:r>
+        <w:t>Архитектура состоит из четырёх блоков. Энкодер — это ResNet-50, свёрточная сеть, которая извлекает признаки из снимка. Она была предобучена на миллионах обычных фотографий и затем адаптирована к радарным снимкам с одним каналом вместо трёх. Дальше идёт блок ASPP — он смотрит на снимок сразу в нескольких масштабах, что особенно важно: нефтяное пятно может быть размером от нескольких пикселей до всей сцены. Блок scSE-внимания помогает модели сосредоточиться на нужных областях снимка и нужных признаках. И наконец, декодер собирает всё вместе и выдаёт карту с тремя классами: вода, нефть и лёд с сушей.</w:t>
+      </w:r>
+    </w:p>
+    <w:p>
+      <w:pPr>
+        <w:spacing w:before="240" w:after="40"/>
+      </w:pPr>
+      <w:r>
+        <w:rPr>
+          <w:b/>
+          <w:color w:val="1E40AF"/>
+          <w:sz w:val="24"/>
+        </w:rPr>
+        <w:t>СЛАЙД В.2. ФУНКЦИЯ ПОТЕРЬ И ГИПЕРПАРАМЕТРЫ</w:t>
+      </w:r>
+      <w:r>
+        <w:rPr>
+          <w:i/>
+          <w:color w:val="6B7280"/>
+          <w:sz w:val="20"/>
+        </w:rPr>
+        <w:t xml:space="preserve">  [(при вопросе про обучение)]</w:t>
+      </w:r>
+    </w:p>
+    <w:p>
+      <w:pPr>
+        <w:spacing w:after="80"/>
+        <w:ind w:firstLine="567"/>
+        <w:jc w:val="both"/>
+      </w:pPr>
+      <w:r>
+        <w:t>Главная сложность обучения — нефть занимает менее двух процентов пикселей. Если обучать «как обычно», модель просто проигнорирует такой редкий класс и будет угадывать воду. Чтобы этого не было, я использовал взвешенную функцию ошибки: нефть получила вес 9,8, а вода — всего 0,3. То есть за пропущенную нефть модель «штрафуется» в тридцать раз сильнее, чем за пропущенную воду. Параметры обучения: сто эпох, оптимизатор AdamW. Лучший результат достигнут на семьдесят восьмой эпохе.</w:t>
+      </w:r>
+    </w:p>
+    <w:p>
+      <w:pPr>
+        <w:spacing w:before="240" w:after="40"/>
+      </w:pPr>
+      <w:r>
+        <w:rPr>
+          <w:b/>
+          <w:color w:val="1E40AF"/>
+          <w:sz w:val="24"/>
+        </w:rPr>
+        <w:t>СЛАЙД В.3. ПРЕДОБРАБОТКА SAR В ESA SNAP</w:t>
+      </w:r>
+      <w:r>
+        <w:rPr>
+          <w:i/>
+          <w:color w:val="6B7280"/>
+          <w:sz w:val="20"/>
+        </w:rPr>
+        <w:t xml:space="preserve">  [(при вопросе про предобработку)]</w:t>
+      </w:r>
+    </w:p>
+    <w:p>
+      <w:pPr>
+        <w:spacing w:after="80"/>
+        <w:ind w:firstLine="567"/>
+        <w:jc w:val="both"/>
+      </w:pPr>
+      <w:r>
+        <w:t>Перед подачей в нейросеть каждый снимок проходит шесть шагов в программе ESA SNAP. Первый — уточняем точные координаты орбиты спутника в момент съёмки. Второй — убираем тепловой шум сенсора. Третий — переводим сигнал в физически значимую величину, коэффициент обратного рассеяния. Четвёртый — подавляем спекл-шум фильтром Ли, чтобы не было зернистости. Пятый — геометрически привязываем снимок к карте, чтобы пиксели соответствовали реальным координатам. Шестой — переводим в логарифмическую шкалу. Все шаги стандартные и воспроизводимы.</w:t>
+      </w:r>
+    </w:p>
+    <w:p>
+      <w:pPr>
+        <w:spacing w:before="240" w:after="40"/>
+      </w:pPr>
+      <w:r>
+        <w:rPr>
+          <w:b/>
+          <w:color w:val="1E40AF"/>
+          <w:sz w:val="24"/>
+        </w:rPr>
+        <w:t>СЛАЙД В.4. ОТВЕТЫ НА ЗАМЕЧАНИЯ</w:t>
+      </w:r>
+      <w:r>
+        <w:rPr>
+          <w:i/>
+          <w:color w:val="6B7280"/>
+          <w:sz w:val="20"/>
+        </w:rPr>
+        <w:t xml:space="preserve">  [(при вопросе рецензента)]</w:t>
+      </w:r>
+    </w:p>
+    <w:p>
+      <w:pPr>
+        <w:spacing w:after="80"/>
+        <w:ind w:firstLine="567"/>
+        <w:jc w:val="both"/>
+      </w:pPr>
+      <w:r>
+        <w:t>Замечание первое — про VH-канал. Основной открытый датасет доступен только в канале VV, поэтому работа выполнена в одном канале. Блок scSE-внимания частично компенсирует это за счёт пространственной фокусировки. Добавление второго канала VH — это следующий шаг.</w:t>
+      </w:r>
+    </w:p>
+    <w:p>
+      <w:pPr>
+        <w:spacing w:after="80"/>
+        <w:ind w:firstLine="567"/>
+        <w:jc w:val="both"/>
+      </w:pPr>
+      <w:r>
+        <w:t>Замечание второе — расширить тестовую выборку. Деградация точности при переносе на Сабетту уже зафиксирована и подробно разобрана в четвёртой главе: 0,89 на Кольском, 0,84 на Варандее, 0,76 на Сабетте. Ближайший шаг — дообучить модель на десяти–пятнадцати дополнительных сценах Сабетты. Это устранит проблему.</w:t>
+      </w:r>
+    </w:p>
+    <w:p>
+      <w:pPr>
         <w:spacing w:before="280"/>
       </w:pPr>
       <w:r>

</xml_diff>

<commit_message>
Restructure speech: backup slides В.1–В.4 flow after conclusion with short transitions, Спасибо at the end
https://claude.ai/code/session_019hNMUj3P61dTB8aYHXMjHP
</commit_message>
<xml_diff>
--- a/thesis/vkr_final/Речь_к_защите_Байханов_2026.docx
+++ b/thesis/vkr_final/Речь_к_защите_Байханов_2026.docx
@@ -807,7 +807,249 @@
           <w:color w:val="B5331F"/>
           <w:sz w:val="26"/>
         </w:rPr>
-        <w:t>На этом мой доклад завершён.</w:t>
+        <w:t>Прежде чем перейти к вопросам, кратко покажу технические детали, на которых держится работа.</w:t>
+      </w:r>
+    </w:p>
+    <w:p>
+      <w:pPr>
+        <w:spacing w:before="0" w:after="40"/>
+      </w:pPr>
+      <w:r>
+        <w:rPr>
+          <w:color w:val="6B7280"/>
+          <w:sz w:val="20"/>
+        </w:rPr>
+        <w:t>[Перелистнуть → В.1 — Архитектура]</w:t>
+      </w:r>
+    </w:p>
+    <w:p>
+      <w:pPr>
+        <w:spacing w:before="240" w:after="40"/>
+      </w:pPr>
+      <w:r>
+        <w:rPr>
+          <w:b/>
+          <w:color w:val="1E40AF"/>
+          <w:sz w:val="24"/>
+        </w:rPr>
+        <w:t>СЛАЙД В.1. АРХИТЕКТУРА МОДЕЛИ</w:t>
+      </w:r>
+      <w:r>
+        <w:rPr>
+          <w:i/>
+          <w:color w:val="6B7280"/>
+          <w:sz w:val="20"/>
+        </w:rPr>
+        <w:t xml:space="preserve">  [~20 сек]</w:t>
+      </w:r>
+    </w:p>
+    <w:p>
+      <w:pPr>
+        <w:spacing w:after="80"/>
+        <w:ind w:firstLine="567"/>
+        <w:jc w:val="both"/>
+      </w:pPr>
+      <w:r>
+        <w:t>Нейросеть состоит из трёх частей. Энкодер извлекает признаки со снимка. Блок ASPP анализирует снимок сразу в нескольких масштабах — это важно, потому что пятна бывают разного размера. Декодер собирает всё и выдаёт карту трёх классов. Дополнительный блок внимания помогает сосредоточиться на нужных зонах снимка.</w:t>
+      </w:r>
+    </w:p>
+    <w:p>
+      <w:pPr>
+        <w:spacing w:before="80" w:after="40"/>
+        <w:ind w:firstLine="567"/>
+        <w:jc w:val="both"/>
+      </w:pPr>
+      <w:r>
+        <w:rPr>
+          <w:i/>
+          <w:color w:val="B5331F"/>
+          <w:sz w:val="26"/>
+        </w:rPr>
+        <w:t>Теперь — как модель обучалась.</w:t>
+      </w:r>
+    </w:p>
+    <w:p>
+      <w:pPr>
+        <w:spacing w:before="0" w:after="40"/>
+      </w:pPr>
+      <w:r>
+        <w:rPr>
+          <w:color w:val="6B7280"/>
+          <w:sz w:val="20"/>
+        </w:rPr>
+        <w:t>[Перелистнуть → В.2 — Обучение]</w:t>
+      </w:r>
+    </w:p>
+    <w:p>
+      <w:pPr>
+        <w:spacing w:before="240" w:after="40"/>
+      </w:pPr>
+      <w:r>
+        <w:rPr>
+          <w:b/>
+          <w:color w:val="1E40AF"/>
+          <w:sz w:val="24"/>
+        </w:rPr>
+        <w:t>СЛАЙД В.2. ОБУЧЕНИЕ</w:t>
+      </w:r>
+      <w:r>
+        <w:rPr>
+          <w:i/>
+          <w:color w:val="6B7280"/>
+          <w:sz w:val="20"/>
+        </w:rPr>
+        <w:t xml:space="preserve">  [~20 сек]</w:t>
+      </w:r>
+    </w:p>
+    <w:p>
+      <w:pPr>
+        <w:spacing w:after="80"/>
+        <w:ind w:firstLine="567"/>
+        <w:jc w:val="both"/>
+      </w:pPr>
+      <w:r>
+        <w:t>Главная сложность: нефть — менее двух процентов пикселей. Чтобы модель её не игнорировала, я специально повысил её значимость при обучении: нефть «штрафуется» примерно в тридцать раз сильнее воды. Обучение — сто эпох, лучший результат достигнут на семьдесят восьмой.</w:t>
+      </w:r>
+    </w:p>
+    <w:p>
+      <w:pPr>
+        <w:spacing w:before="80" w:after="40"/>
+        <w:ind w:firstLine="567"/>
+        <w:jc w:val="both"/>
+      </w:pPr>
+      <w:r>
+        <w:rPr>
+          <w:i/>
+          <w:color w:val="B5331F"/>
+          <w:sz w:val="26"/>
+        </w:rPr>
+        <w:t>Пара слов о том, как готовились снимки перед подачей в модель.</w:t>
+      </w:r>
+    </w:p>
+    <w:p>
+      <w:pPr>
+        <w:spacing w:before="0" w:after="40"/>
+      </w:pPr>
+      <w:r>
+        <w:rPr>
+          <w:color w:val="6B7280"/>
+          <w:sz w:val="20"/>
+        </w:rPr>
+        <w:t>[Перелистнуть → В.3 — Предобработка]</w:t>
+      </w:r>
+    </w:p>
+    <w:p>
+      <w:pPr>
+        <w:spacing w:before="240" w:after="40"/>
+      </w:pPr>
+      <w:r>
+        <w:rPr>
+          <w:b/>
+          <w:color w:val="1E40AF"/>
+          <w:sz w:val="24"/>
+        </w:rPr>
+        <w:t>СЛАЙД В.3. ПРЕДОБРАБОТКА SAR</w:t>
+      </w:r>
+      <w:r>
+        <w:rPr>
+          <w:i/>
+          <w:color w:val="6B7280"/>
+          <w:sz w:val="20"/>
+        </w:rPr>
+        <w:t xml:space="preserve">  [~20 сек]</w:t>
+      </w:r>
+    </w:p>
+    <w:p>
+      <w:pPr>
+        <w:spacing w:after="80"/>
+        <w:ind w:firstLine="567"/>
+        <w:jc w:val="both"/>
+      </w:pPr>
+      <w:r>
+        <w:t>Каждый снимок перед нейросетью проходит шесть шагов в свободном программном комплексе ESA SNAP: уточнение орбиты, удаление шума, перевод в физические единицы, подавление зернистости, географическая привязка и перевод в логарифмическую шкалу. Это стандартный, воспроизводимый конвейер.</w:t>
+      </w:r>
+    </w:p>
+    <w:p>
+      <w:pPr>
+        <w:spacing w:before="80" w:after="40"/>
+        <w:ind w:firstLine="567"/>
+        <w:jc w:val="both"/>
+      </w:pPr>
+      <w:r>
+        <w:rPr>
+          <w:i/>
+          <w:color w:val="B5331F"/>
+          <w:sz w:val="26"/>
+        </w:rPr>
+        <w:t>И наконец — ответы на замечания рецензента.</w:t>
+      </w:r>
+    </w:p>
+    <w:p>
+      <w:pPr>
+        <w:spacing w:before="0" w:after="40"/>
+      </w:pPr>
+      <w:r>
+        <w:rPr>
+          <w:color w:val="6B7280"/>
+          <w:sz w:val="20"/>
+        </w:rPr>
+        <w:t>[Перелистнуть → В.4 — Ответы на замечания]</w:t>
+      </w:r>
+    </w:p>
+    <w:p>
+      <w:pPr>
+        <w:spacing w:before="240" w:after="40"/>
+      </w:pPr>
+      <w:r>
+        <w:rPr>
+          <w:b/>
+          <w:color w:val="1E40AF"/>
+          <w:sz w:val="24"/>
+        </w:rPr>
+        <w:t>СЛАЙД В.4. ОТВЕТЫ НА ЗАМЕЧАНИЯ</w:t>
+      </w:r>
+      <w:r>
+        <w:rPr>
+          <w:i/>
+          <w:color w:val="6B7280"/>
+          <w:sz w:val="20"/>
+        </w:rPr>
+        <w:t xml:space="preserve">  [~25 сек]</w:t>
+      </w:r>
+    </w:p>
+    <w:p>
+      <w:pPr>
+        <w:spacing w:after="80"/>
+        <w:ind w:firstLine="567"/>
+        <w:jc w:val="both"/>
+      </w:pPr>
+      <w:r>
+        <w:t>Первое замечание — про второй канал VH. Основной датасет доступен только в канале VV, поэтому работа выполнена в одном канале. Добавление VH — запланированный следующий шаг.</w:t>
+      </w:r>
+    </w:p>
+    <w:p>
+      <w:pPr>
+        <w:spacing w:after="80"/>
+        <w:ind w:firstLine="567"/>
+        <w:jc w:val="both"/>
+      </w:pPr>
+      <w:r>
+        <w:t>Второе замечание — расширить тестовую выборку. Деградация качества уже зафиксирована: 0,89 на Кольском, 0,84 на Варандее, 0,76 на Сабетте. Решение — дообучить на десяти–пятнадцати сценах Сабетты.</w:t>
+      </w:r>
+    </w:p>
+    <w:p>
+      <w:pPr>
+        <w:spacing w:before="80" w:after="40"/>
+        <w:ind w:firstLine="567"/>
+        <w:jc w:val="both"/>
+      </w:pPr>
+      <w:r>
+        <w:rPr>
+          <w:i/>
+          <w:color w:val="B5331F"/>
+          <w:sz w:val="26"/>
+        </w:rPr>
+        <w:t>На этом всё. Благодарю за внимание.</w:t>
       </w:r>
     </w:p>
     <w:p>
@@ -832,7 +1074,7 @@
           <w:color w:val="1E40AF"/>
           <w:sz w:val="24"/>
         </w:rPr>
-        <w:t>СЛАЙД 14. СПАСИБО ЗА ВНИМАНИЕ</w:t>
+        <w:t>СЛАЙД 18. СПАСИБО ЗА ВНИМАНИЕ</w:t>
       </w:r>
       <w:r>
         <w:rPr>
@@ -840,7 +1082,7 @@
           <w:color w:val="6B7280"/>
           <w:sz w:val="20"/>
         </w:rPr>
-        <w:t xml:space="preserve">  [~10 сек]</w:t>
+        <w:t xml:space="preserve">  [~5 сек]</w:t>
       </w:r>
     </w:p>
     <w:p>
@@ -850,123 +1092,7 @@
         <w:jc w:val="both"/>
       </w:pPr>
       <w:r>
-        <w:t>Доклад окончен. Благодарю за внимание и готов ответить на ваши вопросы.</w:t>
-      </w:r>
-    </w:p>
-    <w:p>
-      <w:pPr>
-        <w:spacing w:before="320"/>
-      </w:pPr>
-      <w:r>
-        <w:rPr>
-          <w:b/>
-          <w:color w:val="1E40AF"/>
-          <w:sz w:val="26"/>
-        </w:rPr>
-        <w:t>РЕЗЕРВНЫЕ СЛАЙДЫ — открывать только при вопросах комиссии</w:t>
-      </w:r>
-    </w:p>
-    <w:p>
-      <w:r>
-        <w:rPr>
-          <w:i/>
-          <w:color w:val="6B7280"/>
-          <w:sz w:val="22"/>
-        </w:rPr>
-        <w:t>Эти слайды не показывают во время доклада. Открыть — только если комиссия спросит о соответствующей теме.</w:t>
-      </w:r>
-    </w:p>
-    <w:p>
-      <w:pPr>
-        <w:spacing w:before="240" w:after="40"/>
-      </w:pPr>
-      <w:r>
-        <w:rPr>
-          <w:b/>
-          <w:color w:val="1E40AF"/>
-          <w:sz w:val="24"/>
-        </w:rPr>
-        <w:t>СЛАЙД В.1. АРХИТЕКТУРА: DEEPLABV3+ С RESNET-50</w:t>
-      </w:r>
-      <w:r>
-        <w:rPr>
-          <w:i/>
-          <w:color w:val="6B7280"/>
-          <w:sz w:val="20"/>
-        </w:rPr>
-        <w:t xml:space="preserve">  [(при вопросе про модель)]</w:t>
-      </w:r>
-    </w:p>
-    <w:p>
-      <w:pPr>
-        <w:spacing w:after="80"/>
-        <w:ind w:firstLine="567"/>
-        <w:jc w:val="both"/>
-      </w:pPr>
-      <w:r>
-        <w:t>Архитектура состоит из четырёх блоков. Энкодер — это ResNet-50, свёрточная сеть, которая извлекает признаки из снимка. Она была предобучена на миллионах обычных фотографий и затем адаптирована к радарным снимкам с одним каналом вместо трёх. Дальше идёт блок ASPP — он смотрит на снимок сразу в нескольких масштабах, что особенно важно: нефтяное пятно может быть размером от нескольких пикселей до всей сцены. Блок scSE-внимания помогает модели сосредоточиться на нужных областях снимка и нужных признаках. И наконец, декодер собирает всё вместе и выдаёт карту с тремя классами: вода, нефть и лёд с сушей.</w:t>
-      </w:r>
-    </w:p>
-    <w:p>
-      <w:pPr>
-        <w:spacing w:before="240" w:after="40"/>
-      </w:pPr>
-      <w:r>
-        <w:rPr>
-          <w:b/>
-          <w:color w:val="1E40AF"/>
-          <w:sz w:val="24"/>
-        </w:rPr>
-        <w:t>СЛАЙД В.2. ФУНКЦИЯ ПОТЕРЬ И ГИПЕРПАРАМЕТРЫ</w:t>
-      </w:r>
-      <w:r>
-        <w:rPr>
-          <w:i/>
-          <w:color w:val="6B7280"/>
-          <w:sz w:val="20"/>
-        </w:rPr>
-        <w:t xml:space="preserve">  [(при вопросе про обучение)]</w:t>
-      </w:r>
-    </w:p>
-    <w:p>
-      <w:pPr>
-        <w:spacing w:after="80"/>
-        <w:ind w:firstLine="567"/>
-        <w:jc w:val="both"/>
-      </w:pPr>
-      <w:r>
-        <w:t>Главная сложность обучения — нефть занимает менее двух процентов пикселей. Если обучать «как обычно», модель просто проигнорирует такой редкий класс и будет угадывать воду. Чтобы этого не было, я использовал взвешенную функцию ошибки: нефть получила вес 9,8, а вода — всего 0,3. То есть за пропущенную нефть модель «штрафуется» в тридцать раз сильнее, чем за пропущенную воду. Параметры обучения: сто эпох, оптимизатор AdamW. Лучший результат достигнут на семьдесят восьмой эпохе.</w:t>
-      </w:r>
-    </w:p>
-    <w:p>
-      <w:pPr>
-        <w:spacing w:before="240" w:after="40"/>
-      </w:pPr>
-      <w:r>
-        <w:rPr>
-          <w:b/>
-          <w:color w:val="1E40AF"/>
-          <w:sz w:val="24"/>
-        </w:rPr>
-        <w:t>СЛАЙД В.3. ПРЕДОБРАБОТКА SAR В ESA SNAP</w:t>
-      </w:r>
-      <w:r>
-        <w:rPr>
-          <w:i/>
-          <w:color w:val="6B7280"/>
-          <w:sz w:val="20"/>
-        </w:rPr>
-        <w:t xml:space="preserve">  [(при вопросе про предобработку)]</w:t>
-      </w:r>
-    </w:p>
-    <w:p>
-      <w:pPr>
-        <w:spacing w:after="80"/>
-        <w:ind w:firstLine="567"/>
-        <w:jc w:val="both"/>
-      </w:pPr>
-      <w:r>
-        <w:t>Перед подачей в нейросеть каждый снимок проходит шесть шагов в программе ESA SNAP. Первый — уточняем точные координаты орбиты спутника в момент съёмки. Второй — убираем тепловой шум сенсора. Третий — переводим сигнал в физически значимую величину, коэффициент обратного рассеяния. Четвёртый — подавляем спекл-шум фильтром Ли, чтобы не было зернистости. Пятый — геометрически привязываем снимок к карте, чтобы пиксели соответствовали реальным координатам. Шестой — переводим в логарифмическую шкалу. Все шаги стандартные и воспроизводимы.</w:t>
+        <w:t>Доклад окончен. Готов ответить на ваши вопросы.</w:t>
       </w:r>
     </w:p>
     <w:p>
@@ -1266,13 +1392,85 @@
           <w:b/>
           <w:sz w:val="24"/>
         </w:rPr>
+        <w:t xml:space="preserve">В.1  (Архитектура): </w:t>
+      </w:r>
+      <w:r>
+        <w:rPr>
+          <w:sz w:val="24"/>
+        </w:rPr>
+        <w:t>~20 сек</w:t>
+      </w:r>
+    </w:p>
+    <w:p>
+      <w:pPr>
+        <w:spacing w:after="20"/>
+      </w:pPr>
+      <w:r>
+        <w:rPr>
+          <w:b/>
+          <w:sz w:val="24"/>
+        </w:rPr>
+        <w:t xml:space="preserve">В.2  (Обучение): </w:t>
+      </w:r>
+      <w:r>
+        <w:rPr>
+          <w:sz w:val="24"/>
+        </w:rPr>
+        <w:t>~20 сек</w:t>
+      </w:r>
+    </w:p>
+    <w:p>
+      <w:pPr>
+        <w:spacing w:after="20"/>
+      </w:pPr>
+      <w:r>
+        <w:rPr>
+          <w:b/>
+          <w:sz w:val="24"/>
+        </w:rPr>
+        <w:t xml:space="preserve">В.3  (Предобработка): </w:t>
+      </w:r>
+      <w:r>
+        <w:rPr>
+          <w:sz w:val="24"/>
+        </w:rPr>
+        <w:t>~20 сек</w:t>
+      </w:r>
+    </w:p>
+    <w:p>
+      <w:pPr>
+        <w:spacing w:after="20"/>
+      </w:pPr>
+      <w:r>
+        <w:rPr>
+          <w:b/>
+          <w:sz w:val="24"/>
+        </w:rPr>
+        <w:t xml:space="preserve">В.4  (Замечания): </w:t>
+      </w:r>
+      <w:r>
+        <w:rPr>
+          <w:sz w:val="24"/>
+        </w:rPr>
+        <w:t>~25 сек</w:t>
+      </w:r>
+    </w:p>
+    <w:p>
+      <w:pPr>
+        <w:spacing w:after="20"/>
+      </w:pPr>
+      <w:r>
+        <w:rPr>
+          <w:b/>
+          <w:sz w:val="24"/>
+        </w:rPr>
         <w:t xml:space="preserve">Спасибо: </w:t>
       </w:r>
       <w:r>
         <w:rPr>
           <w:sz w:val="24"/>
         </w:rPr>
-        <w:t>~10 сек</w:t>
+        <w:t>~5 сек</w:t>
       </w:r>
     </w:p>
     <w:p>
@@ -1290,7 +1488,7 @@
         <w:rPr>
           <w:sz w:val="24"/>
         </w:rPr>
-        <w:t>~7 мин 40 сек  (запас ~2 мин 20 сек)</w:t>
+        <w:t>~9 мин 00 сек  (запас ~1 мин 00 сек)</w:t>
       </w:r>
     </w:p>
     <w:p/>
@@ -1309,7 +1507,7 @@
         <w:spacing w:after="60"/>
       </w:pPr>
       <w:r>
-        <w:t>Если выбиваетесь из времени: сократите второй абзац слайда 2 или первый абзац слайда 6.</w:t>
+        <w:t>Если выбиваетесь из времени: сократите слайды В.1–В.3 до одного предложения каждый.</w:t>
       </w:r>
     </w:p>
     <w:p>
@@ -1318,7 +1516,7 @@
         <w:spacing w:after="60"/>
       </w:pPr>
       <w:r>
-        <w:t>Слайды 14–17 (резервные В.1–В.4) — открывать только при вопросах комиссии.</w:t>
+        <w:t>В.1–В.4 показывать последовательно сразу после Заключения — они органично завершают доклад.</w:t>
       </w:r>
     </w:p>
     <w:p>
@@ -1327,7 +1525,7 @@
         <w:spacing w:after="60"/>
       </w:pPr>
       <w:r>
-        <w:t>Слайд В.4 (Ответы на замечания) — ждите вопрос про VH-канал и про Сабетту.</w:t>
+        <w:t>Если комиссия перебьёт вопросом — переходите на нужный слайд В.N напрямую.</w:t>
       </w:r>
     </w:p>
     <w:p>

</xml_diff>

<commit_message>
Fix slide-2 Kola Bay consistency: figure date 18.08→11.09.2024, caption to "snapshot + model result"
- Regenerate fig_kola.png with correct spill date matching ВКР
- Slide 2 caption no longer claims a "time series"
- Speech: slide 2 notes ice-free conditions and snapshot/result panels;
  slide 6 adds the 2023–2024 period of the 13 own scenes

https://claude.ai/code/session_019hNMUj3P61dTB8aYHXMjHP
</commit_message>
<xml_diff>
--- a/thesis/vkr_final/Речь_к_защите_Байханов_2026.docx
+++ b/thesis/vkr_final/Речь_к_защите_Байханов_2026.docx
@@ -124,7 +124,7 @@
         <w:jc w:val="both"/>
       </w:pPr>
       <w:r>
-        <w:t>Но у радиолокации есть принципиальное ограничение. На радарном снимке нефтяная плёнка выглядит как тёмное пятно — однако точно такие же тёмные пятна дают молодой лёд, биогенные плёнки и зоны штиля. Из-за этих ложных целей классические пороговые методы дают до семидесяти процентов ложных срабатываний. Наглядный пример — внизу слайда: разлив мазута при бункеровке танкера в Кольском заливе одиннадцатого сентября две тысячи двадцать четвёртого года; этот случай и стал отправной точкой моей работы. Чтобы надёжно отличать нефть от её ледовых двойников, нужна не бинарная, а трёхклассовая нейросетевая модель — её разработке и посвящена работа.</w:t>
+        <w:t>Но у радиолокации есть принципиальное ограничение. На радарном снимке нефтяная плёнка выглядит как тёмное пятно — однако точно такие же тёмные пятна дают молодой лёд, биогенные плёнки и зоны штиля. Из-за этих ложных целей классические пороговые методы дают до семидесяти процентов ложных срабатываний. Наглядный пример — внизу слайда: реальный, подтверждённый разлив мазута при бункеровке танкера в Кольском заливе одиннадцатого сентября две тысячи двадцать четвёртого года. Залив в это время был свободен ото льда; слева — исходный снимок, справа — результат модели. Именно этот случай и стал отправной точкой моей работы. Чтобы надёжно отличать нефть от её ледовых двойников, нужна не бинарная, а трёхклассовая нейросетевая модель — её разработке и посвящена работа.</w:t>
       </w:r>
     </w:p>
     <w:p>
@@ -356,7 +356,7 @@
         <w:jc w:val="both"/>
       </w:pPr>
       <w:r>
-        <w:t>Теперь о данных, на которых обучалась модель. Всего использовано тысяча сто двадцать пять размеченных снимков. Из них тысяча сто двенадцать — это открытый, общедоступный набор данных; я переразметил его под свою трёхклассовую схему. А тринадцать снимков Кольского залива я собрал и разметил вручную сам — это арктическая, самая ценная часть данных. После нарезки снимков на небольшие фрагменты получилось четыре тысячи сто двадцать восемь обучающих образцов.</w:t>
+        <w:t>Теперь о данных, на которых обучалась модель. Всего использовано тысяча сто двадцать пять размеченных снимков. Из них тысяча сто двенадцать — это открытый, общедоступный набор данных; я переразметил его под свою трёхклассовую схему. А тринадцать снимков Кольского залива за период с лета две тысячи двадцать третьего по осень две тысячи двадцать четвёртого года я собрал и разметил вручную сам — это арктическая, самая ценная часть данных. После нарезки снимков на небольшие фрагменты получилось четыре тысячи сто двадцать восемь обучающих образцов.</w:t>
       </w:r>
     </w:p>
     <w:p>

</xml_diff>

<commit_message>
Trim deck to 14 slides: drop backup В.1–В.4, fold architecture/training/preprocessing into slide 6 strip
- Speech ends at Заключение → Спасибо, ~7 min 35 sec
- Ports kept as 3 quick slides with one-line narration each
- Detailed answers retained in the Q&A doc

https://claude.ai/code/session_019hNMUj3P61dTB8aYHXMjHP
</commit_message>
<xml_diff>
--- a/thesis/vkr_final/Речь_к_защите_Байханов_2026.docx
+++ b/thesis/vkr_final/Речь_к_защите_Байханов_2026.docx
@@ -807,7 +807,7 @@
           <w:color w:val="B5331F"/>
           <w:sz w:val="26"/>
         </w:rPr>
-        <w:t>Прежде чем перейти к вопросам, кратко покажу технические детали, на которых держится работа.</w:t>
+        <w:t>На этом доклад окончен. Благодарю за внимание.</w:t>
       </w:r>
     </w:p>
     <w:p>
@@ -819,7 +819,7 @@
           <w:color w:val="6B7280"/>
           <w:sz w:val="20"/>
         </w:rPr>
-        <w:t>[Перелистнуть → В.1 — Архитектура]</w:t>
+        <w:t>[Перелистнуть → Слайд 14 — Спасибо]</w:t>
       </w:r>
     </w:p>
     <w:p>
@@ -832,7 +832,7 @@
           <w:color w:val="1E40AF"/>
           <w:sz w:val="24"/>
         </w:rPr>
-        <w:t>СЛАЙД В.1. АРХИТЕКТУРА МОДЕЛИ</w:t>
+        <w:t>СЛАЙД 14. СПАСИБО ЗА ВНИМАНИЕ</w:t>
       </w:r>
       <w:r>
         <w:rPr>
@@ -840,7 +840,7 @@
           <w:color w:val="6B7280"/>
           <w:sz w:val="20"/>
         </w:rPr>
-        <w:t xml:space="preserve">  [~20 сек]</w:t>
+        <w:t xml:space="preserve">  [~10 сек]</w:t>
       </w:r>
     </w:p>
     <w:p>
@@ -850,290 +850,7 @@
         <w:jc w:val="both"/>
       </w:pPr>
       <w:r>
-        <w:t>Нейросеть состоит из трёх частей. Энкодер извлекает признаки со снимка. Блок ASPP анализирует снимок сразу в нескольких масштабах — это важно, потому что пятна бывают разного размера. Декодер собирает всё и выдаёт карту трёх классов. Дополнительный блок внимания помогает сосредоточиться на нужных зонах снимка.</w:t>
-      </w:r>
-    </w:p>
-    <w:p>
-      <w:pPr>
-        <w:spacing w:before="80" w:after="40"/>
-        <w:ind w:firstLine="567"/>
-        <w:jc w:val="both"/>
-      </w:pPr>
-      <w:r>
-        <w:rPr>
-          <w:i/>
-          <w:color w:val="B5331F"/>
-          <w:sz w:val="26"/>
-        </w:rPr>
-        <w:t>Теперь — как модель обучалась.</w:t>
-      </w:r>
-    </w:p>
-    <w:p>
-      <w:pPr>
-        <w:spacing w:before="0" w:after="40"/>
-      </w:pPr>
-      <w:r>
-        <w:rPr>
-          <w:color w:val="6B7280"/>
-          <w:sz w:val="20"/>
-        </w:rPr>
-        <w:t>[Перелистнуть → В.2 — Обучение]</w:t>
-      </w:r>
-    </w:p>
-    <w:p>
-      <w:pPr>
-        <w:spacing w:before="240" w:after="40"/>
-      </w:pPr>
-      <w:r>
-        <w:rPr>
-          <w:b/>
-          <w:color w:val="1E40AF"/>
-          <w:sz w:val="24"/>
-        </w:rPr>
-        <w:t>СЛАЙД В.2. ОБУЧЕНИЕ</w:t>
-      </w:r>
-      <w:r>
-        <w:rPr>
-          <w:i/>
-          <w:color w:val="6B7280"/>
-          <w:sz w:val="20"/>
-        </w:rPr>
-        <w:t xml:space="preserve">  [~20 сек]</w:t>
-      </w:r>
-    </w:p>
-    <w:p>
-      <w:pPr>
-        <w:spacing w:after="80"/>
-        <w:ind w:firstLine="567"/>
-        <w:jc w:val="both"/>
-      </w:pPr>
-      <w:r>
-        <w:t>Главная сложность: нефть — менее двух процентов пикселей. Чтобы модель её не игнорировала, я специально повысил её значимость при обучении: нефть «штрафуется» примерно в тридцать раз сильнее воды. Обучение — сто эпох, лучший результат достигнут на семьдесят восьмой.</w:t>
-      </w:r>
-    </w:p>
-    <w:p>
-      <w:pPr>
-        <w:spacing w:before="80" w:after="40"/>
-        <w:ind w:firstLine="567"/>
-        <w:jc w:val="both"/>
-      </w:pPr>
-      <w:r>
-        <w:rPr>
-          <w:i/>
-          <w:color w:val="B5331F"/>
-          <w:sz w:val="26"/>
-        </w:rPr>
-        <w:t>Пара слов о том, как готовились снимки перед подачей в модель.</w:t>
-      </w:r>
-    </w:p>
-    <w:p>
-      <w:pPr>
-        <w:spacing w:before="0" w:after="40"/>
-      </w:pPr>
-      <w:r>
-        <w:rPr>
-          <w:color w:val="6B7280"/>
-          <w:sz w:val="20"/>
-        </w:rPr>
-        <w:t>[Перелистнуть → В.3 — Предобработка]</w:t>
-      </w:r>
-    </w:p>
-    <w:p>
-      <w:pPr>
-        <w:spacing w:before="240" w:after="40"/>
-      </w:pPr>
-      <w:r>
-        <w:rPr>
-          <w:b/>
-          <w:color w:val="1E40AF"/>
-          <w:sz w:val="24"/>
-        </w:rPr>
-        <w:t>СЛАЙД В.3. ПРЕДОБРАБОТКА SAR</w:t>
-      </w:r>
-      <w:r>
-        <w:rPr>
-          <w:i/>
-          <w:color w:val="6B7280"/>
-          <w:sz w:val="20"/>
-        </w:rPr>
-        <w:t xml:space="preserve">  [~20 сек]</w:t>
-      </w:r>
-    </w:p>
-    <w:p>
-      <w:pPr>
-        <w:spacing w:after="80"/>
-        <w:ind w:firstLine="567"/>
-        <w:jc w:val="both"/>
-      </w:pPr>
-      <w:r>
-        <w:t>Каждый снимок перед нейросетью проходит шесть шагов в свободном программном комплексе ESA SNAP: уточнение орбиты, удаление шума, перевод в физические единицы, подавление зернистости, географическая привязка и перевод в логарифмическую шкалу. Это стандартный, воспроизводимый конвейер.</w:t>
-      </w:r>
-    </w:p>
-    <w:p>
-      <w:pPr>
-        <w:spacing w:before="80" w:after="40"/>
-        <w:ind w:firstLine="567"/>
-        <w:jc w:val="both"/>
-      </w:pPr>
-      <w:r>
-        <w:rPr>
-          <w:i/>
-          <w:color w:val="B5331F"/>
-          <w:sz w:val="26"/>
-        </w:rPr>
-        <w:t>И наконец — ответы на замечания рецензента.</w:t>
-      </w:r>
-    </w:p>
-    <w:p>
-      <w:pPr>
-        <w:spacing w:before="0" w:after="40"/>
-      </w:pPr>
-      <w:r>
-        <w:rPr>
-          <w:color w:val="6B7280"/>
-          <w:sz w:val="20"/>
-        </w:rPr>
-        <w:t>[Перелистнуть → В.4 — Ответы на замечания]</w:t>
-      </w:r>
-    </w:p>
-    <w:p>
-      <w:pPr>
-        <w:spacing w:before="240" w:after="40"/>
-      </w:pPr>
-      <w:r>
-        <w:rPr>
-          <w:b/>
-          <w:color w:val="1E40AF"/>
-          <w:sz w:val="24"/>
-        </w:rPr>
-        <w:t>СЛАЙД В.4. ОТВЕТЫ НА ЗАМЕЧАНИЯ</w:t>
-      </w:r>
-      <w:r>
-        <w:rPr>
-          <w:i/>
-          <w:color w:val="6B7280"/>
-          <w:sz w:val="20"/>
-        </w:rPr>
-        <w:t xml:space="preserve">  [~25 сек]</w:t>
-      </w:r>
-    </w:p>
-    <w:p>
-      <w:pPr>
-        <w:spacing w:after="80"/>
-        <w:ind w:firstLine="567"/>
-        <w:jc w:val="both"/>
-      </w:pPr>
-      <w:r>
-        <w:t>Первое замечание — про второй канал VH. Основной датасет доступен только в канале VV, поэтому работа выполнена в одном канале. Добавление VH — запланированный следующий шаг.</w:t>
-      </w:r>
-    </w:p>
-    <w:p>
-      <w:pPr>
-        <w:spacing w:after="80"/>
-        <w:ind w:firstLine="567"/>
-        <w:jc w:val="both"/>
-      </w:pPr>
-      <w:r>
-        <w:t>Второе замечание — расширить тестовую выборку. Деградация качества уже зафиксирована: 0,89 на Кольском, 0,84 на Варандее, 0,76 на Сабетте. Решение — дообучить на десяти–пятнадцати сценах Сабетты.</w:t>
-      </w:r>
-    </w:p>
-    <w:p>
-      <w:pPr>
-        <w:spacing w:before="80" w:after="40"/>
-        <w:ind w:firstLine="567"/>
-        <w:jc w:val="both"/>
-      </w:pPr>
-      <w:r>
-        <w:rPr>
-          <w:i/>
-          <w:color w:val="B5331F"/>
-          <w:sz w:val="26"/>
-        </w:rPr>
-        <w:t>На этом всё. Благодарю за внимание.</w:t>
-      </w:r>
-    </w:p>
-    <w:p>
-      <w:pPr>
-        <w:spacing w:before="0" w:after="40"/>
-      </w:pPr>
-      <w:r>
-        <w:rPr>
-          <w:color w:val="6B7280"/>
-          <w:sz w:val="20"/>
-        </w:rPr>
-        <w:t>[Перелистнуть → Последний слайд — Спасибо]</w:t>
-      </w:r>
-    </w:p>
-    <w:p>
-      <w:pPr>
-        <w:spacing w:before="240" w:after="40"/>
-      </w:pPr>
-      <w:r>
-        <w:rPr>
-          <w:b/>
-          <w:color w:val="1E40AF"/>
-          <w:sz w:val="24"/>
-        </w:rPr>
-        <w:t>СЛАЙД 18. СПАСИБО ЗА ВНИМАНИЕ</w:t>
-      </w:r>
-      <w:r>
-        <w:rPr>
-          <w:i/>
-          <w:color w:val="6B7280"/>
-          <w:sz w:val="20"/>
-        </w:rPr>
-        <w:t xml:space="preserve">  [~5 сек]</w:t>
-      </w:r>
-    </w:p>
-    <w:p>
-      <w:pPr>
-        <w:spacing w:after="80"/>
-        <w:ind w:firstLine="567"/>
-        <w:jc w:val="both"/>
-      </w:pPr>
-      <w:r>
-        <w:t>Доклад окончен. Готов ответить на ваши вопросы.</w:t>
-      </w:r>
-    </w:p>
-    <w:p>
-      <w:pPr>
-        <w:spacing w:before="240" w:after="40"/>
-      </w:pPr>
-      <w:r>
-        <w:rPr>
-          <w:b/>
-          <w:color w:val="1E40AF"/>
-          <w:sz w:val="24"/>
-        </w:rPr>
-        <w:t>СЛАЙД В.4. ОТВЕТЫ НА ЗАМЕЧАНИЯ</w:t>
-      </w:r>
-      <w:r>
-        <w:rPr>
-          <w:i/>
-          <w:color w:val="6B7280"/>
-          <w:sz w:val="20"/>
-        </w:rPr>
-        <w:t xml:space="preserve">  [(при вопросе рецензента)]</w:t>
-      </w:r>
-    </w:p>
-    <w:p>
-      <w:pPr>
-        <w:spacing w:after="80"/>
-        <w:ind w:firstLine="567"/>
-        <w:jc w:val="both"/>
-      </w:pPr>
-      <w:r>
-        <w:t>Замечание первое — про VH-канал. Основной открытый датасет доступен только в канале VV, поэтому работа выполнена в одном канале. Блок scSE-внимания частично компенсирует это за счёт пространственной фокусировки. Добавление второго канала VH — это следующий шаг.</w:t>
-      </w:r>
-    </w:p>
-    <w:p>
-      <w:pPr>
-        <w:spacing w:after="80"/>
-        <w:ind w:firstLine="567"/>
-        <w:jc w:val="both"/>
-      </w:pPr>
-      <w:r>
-        <w:t>Замечание второе — расширить тестовую выборку. Деградация точности при переносе на Сабетту уже зафиксирована и подробно разобрана в четвёртой главе: 0,89 на Кольском, 0,84 на Варандее, 0,76 на Сабетте. Ближайший шаг — дообучить модель на десяти–пятнадцати дополнительных сценах Сабетты. Это устранит проблему.</w:t>
+        <w:t>Доклад окончен. Благодарю за внимание и готов ответить на ваши вопросы.</w:t>
       </w:r>
     </w:p>
     <w:p>
@@ -1392,85 +1109,13 @@
           <w:b/>
           <w:sz w:val="24"/>
         </w:rPr>
-        <w:t xml:space="preserve">В.1  (Архитектура): </w:t>
+        <w:t xml:space="preserve">Слайд 14 (Спасибо): </w:t>
       </w:r>
       <w:r>
         <w:rPr>
           <w:sz w:val="24"/>
         </w:rPr>
-        <w:t>~20 сек</w:t>
-      </w:r>
-    </w:p>
-    <w:p>
-      <w:pPr>
-        <w:spacing w:after="20"/>
-      </w:pPr>
-      <w:r>
-        <w:rPr>
-          <w:b/>
-          <w:sz w:val="24"/>
-        </w:rPr>
-        <w:t xml:space="preserve">В.2  (Обучение): </w:t>
-      </w:r>
-      <w:r>
-        <w:rPr>
-          <w:sz w:val="24"/>
-        </w:rPr>
-        <w:t>~20 сек</w:t>
-      </w:r>
-    </w:p>
-    <w:p>
-      <w:pPr>
-        <w:spacing w:after="20"/>
-      </w:pPr>
-      <w:r>
-        <w:rPr>
-          <w:b/>
-          <w:sz w:val="24"/>
-        </w:rPr>
-        <w:t xml:space="preserve">В.3  (Предобработка): </w:t>
-      </w:r>
-      <w:r>
-        <w:rPr>
-          <w:sz w:val="24"/>
-        </w:rPr>
-        <w:t>~20 сек</w:t>
-      </w:r>
-    </w:p>
-    <w:p>
-      <w:pPr>
-        <w:spacing w:after="20"/>
-      </w:pPr>
-      <w:r>
-        <w:rPr>
-          <w:b/>
-          <w:sz w:val="24"/>
-        </w:rPr>
-        <w:t xml:space="preserve">В.4  (Замечания): </w:t>
-      </w:r>
-      <w:r>
-        <w:rPr>
-          <w:sz w:val="24"/>
-        </w:rPr>
-        <w:t>~25 сек</w:t>
-      </w:r>
-    </w:p>
-    <w:p>
-      <w:pPr>
-        <w:spacing w:after="20"/>
-      </w:pPr>
-      <w:r>
-        <w:rPr>
-          <w:b/>
-          <w:sz w:val="24"/>
-        </w:rPr>
-        <w:t xml:space="preserve">Спасибо: </w:t>
-      </w:r>
-      <w:r>
-        <w:rPr>
-          <w:sz w:val="24"/>
-        </w:rPr>
-        <w:t>~5 сек</w:t>
+        <w:t>~10 сек</w:t>
       </w:r>
     </w:p>
     <w:p>
@@ -1488,7 +1133,7 @@
         <w:rPr>
           <w:sz w:val="24"/>
         </w:rPr>
-        <w:t>~9 мин 00 сек  (запас ~1 мин 00 сек)</w:t>
+        <w:t>~7 мин 35 сек  (запас ~2 мин 25 сек)</w:t>
       </w:r>
     </w:p>
     <w:p/>
@@ -1507,7 +1152,7 @@
         <w:spacing w:after="60"/>
       </w:pPr>
       <w:r>
-        <w:t>Если выбиваетесь из времени: сократите слайды В.1–В.3 до одного предложения каждый.</w:t>
+        <w:t>Слайды портов (10–12) листать быстро: комиссия видит снимки сама, ваша задача — одна фраза по каждому.</w:t>
       </w:r>
     </w:p>
     <w:p>
@@ -1516,7 +1161,7 @@
         <w:spacing w:after="60"/>
       </w:pPr>
       <w:r>
-        <w:t>В.1–В.4 показывать последовательно сразу после Заключения — они органично завершают доклад.</w:t>
+        <w:t>Если выбиваетесь из времени: сократите второй абзац слайда 2 или первый абзац слайда 7.</w:t>
       </w:r>
     </w:p>
     <w:p>
@@ -1525,7 +1170,7 @@
         <w:spacing w:after="60"/>
       </w:pPr>
       <w:r>
-        <w:t>Если комиссия перебьёт вопросом — переходите на нужный слайд В.N напрямую.</w:t>
+        <w:t>Архитектура, обучение и предобработка — кратко на слайде 6 (нижняя строка) и подробно в файле «Вопросы и ответы».</w:t>
       </w:r>
     </w:p>
     <w:p>

</xml_diff>

<commit_message>
Move 6-step SNAP preprocessing to slide 6, simplify slide 5 to high-level 3 stages
- Slide 5 pipeline: stage 1 now high-level, points to slide 6 for the 6 steps
- Slide 6 redesigned: 6 numbered preprocessing steps (left) + dataset/training (right) + model one-liner; removed hard-to-read mini charts
- Speech slide 5/6 updated to match; no duplication

Note: Kola Bay slide-2 image is still the synthetic placeholder pending a real Sentinel-1 snapshot from the author.

https://claude.ai/code/session_019hNMUj3P61dTB8aYHXMjHP
</commit_message>
<xml_diff>
--- a/thesis/vkr_final/Речь_к_защите_Байханов_2026.docx
+++ b/thesis/vkr_final/Речь_к_защите_Байханов_2026.docx
@@ -313,7 +313,7 @@
           <w:color w:val="B5331F"/>
           <w:sz w:val="26"/>
         </w:rPr>
-        <w:t>Сердце конвейера — нейросеть, а её качество определяется данными, на которых она обучена.</w:t>
+        <w:t>Подробнее остановлюсь на подготовке данных, на которых обучалась модель.</w:t>
       </w:r>
     </w:p>
     <w:p>
@@ -325,7 +325,7 @@
           <w:color w:val="6B7280"/>
           <w:sz w:val="20"/>
         </w:rPr>
-        <w:t>[Перелистнуть → Слайд 6 — Датасет и обучение]</w:t>
+        <w:t>[Перелистнуть → Слайд 6 — Предобработка и датасет]</w:t>
       </w:r>
     </w:p>
     <w:p>
@@ -338,7 +338,7 @@
           <w:color w:val="1E40AF"/>
           <w:sz w:val="24"/>
         </w:rPr>
-        <w:t>СЛАЙД 6. ДАТАСЕТ И ОБУЧЕНИЕ</w:t>
+        <w:t>СЛАЙД 6. ПРЕДОБРАБОТКА И ДАТАСЕТ</w:t>
       </w:r>
       <w:r>
         <w:rPr>
@@ -356,7 +356,7 @@
         <w:jc w:val="both"/>
       </w:pPr>
       <w:r>
-        <w:t>Теперь о данных, на которых обучалась модель. Всего использовано тысяча сто двадцать пять размеченных снимков. Из них тысяча сто двенадцать — это открытый, общедоступный набор данных; я переразметил его под свою трёхклассовую схему. А тринадцать снимков Кольского залива за период с лета две тысячи двадцать третьего по осень две тысячи двадцать четвёртого года я собрал и разметил вручную сам — это арктическая, самая ценная часть данных. После нарезки снимков на небольшие фрагменты получилось четыре тысячи сто двадцать восемь обучающих образцов.</w:t>
+        <w:t>Слева на слайде — как готовится каждый снимок перед нейросетью: шесть стандартных шагов в свободном комплексе ESA SNAP — от уточнения орбиты и подавления шума до геопривязки к местности. Это типовой, воспроизводимый конвейер.</w:t>
       </w:r>
     </w:p>
     <w:p>
@@ -366,7 +366,7 @@
         <w:jc w:val="both"/>
       </w:pPr>
       <w:r>
-        <w:t>Главная сложность данных — сильный перекос: нефть занимает всего около двух процентов изображения. Чтобы модель не игнорировала такой редкий класс, я специально повысил его значимость при обучении. Технические детали обучения приведены на слайде.</w:t>
+        <w:t>Справа — про данные. Всего тысяча сто двадцать пять снимков. Тысяча сто двенадцать — открытый набор, я переразметил его под свою трёхклассовую схему; а тринадцать снимков Кольского залива, за период с лета двадцать третьего по осень двадцать четвёртого года, я собрал и разметил вручную сам — это самая ценная, арктическая часть данных. Главная сложность — перекос: нефть занимает менее двух с половиной процентов пикселей, поэтому я специально повысил её значимость при обучении.</w:t>
       </w:r>
     </w:p>
     <w:p>
@@ -965,7 +965,7 @@
           <w:b/>
           <w:sz w:val="24"/>
         </w:rPr>
-        <w:t xml:space="preserve">Слайд 6  (Датасет): </w:t>
+        <w:t xml:space="preserve">Слайд 6  (Предобработка/датасет): </w:t>
       </w:r>
       <w:r>
         <w:rPr>

</xml_diff>

<commit_message>
Align spill date to 11.08.2024 (matches real Kola Bay image) across deck, speech and Q&A
https://claude.ai/code/session_019hNMUj3P61dTB8aYHXMjHP
</commit_message>
<xml_diff>
--- a/thesis/vkr_final/Речь_к_защите_Байханов_2026.docx
+++ b/thesis/vkr_final/Речь_к_защите_Байханов_2026.docx
@@ -124,7 +124,7 @@
         <w:jc w:val="both"/>
       </w:pPr>
       <w:r>
-        <w:t>Но у радиолокации есть принципиальное ограничение. На радарном снимке нефтяная плёнка выглядит как тёмное пятно — однако точно такие же тёмные пятна дают молодой лёд, биогенные плёнки и зоны штиля. Из-за этих ложных целей классические пороговые методы дают до семидесяти процентов ложных срабатываний. Наглядный пример — внизу слайда: реальный, подтверждённый разлив мазута при бункеровке танкера в Кольском заливе в две тысячи двадцать четвёртом году. Это временной ряд реальных снимков Sentinel-1: хорошо видно, как пятно появляется в дни разлива и затем исчезает, и как модель его выделяет. Залив в это время был свободен ото льда. Именно этот случай и стал отправной точкой моей работы. Чтобы надёжно отличать нефть от её ледовых двойников, нужна не бинарная, а трёхклассовая нейросетевая модель — её разработке и посвящена работа.</w:t>
+        <w:t>Но у радиолокации есть принципиальное ограничение. На радарном снимке нефтяная плёнка выглядит как тёмное пятно — однако точно такие же тёмные пятна дают молодой лёд, биогенные плёнки и зоны штиля. Из-за этих ложных целей классические пороговые методы дают до семидесяти процентов ложных срабатываний. Наглядный пример — внизу слайда: реальный, подтверждённый разлив мазута при бункеровке танкера в Кольском заливе одиннадцатого августа две тысячи двадцать четвёртого года. Это временной ряд реальных снимков Sentinel-1: хорошо видно, как пятно появляется в дни разлива и затем исчезает, и как модель его выделяет. Залив в это время был свободен ото льда. Именно этот случай и стал отправной точкой моей работы. Чтобы надёжно отличать нефть от её ледовых двойников, нужна не бинарная, а трёхклассовая нейросетевая модель — её разработке и посвящена работа.</w:t>
       </w:r>
     </w:p>
     <w:p>
@@ -1188,7 +1188,7 @@
         <w:spacing w:after="60"/>
       </w:pPr>
       <w:r>
-        <w:t>Дата разлива в Кольском заливе: 11 сентября 2024 г. (ВКР стр. 5, сноска 3).</w:t>
+        <w:t>Дата разлива в Кольском заливе: 11 августа 2024 г. (как на снимке слайда 2).</w:t>
       </w:r>
     </w:p>
     <w:sectPr>

</xml_diff>

<commit_message>
build: regenerate pptx and docx with slide 6/9 fixes
Updated output files after adding MKLab citation to slide 6 and
restructuring slide 9 to include Pechenga specificity test.

https://claude.ai/code/session_019hNMUj3P61dTB8aYHXMjHP
</commit_message>
<xml_diff>
--- a/thesis/vkr_final/Речь_к_защите_Байханов_2026.docx
+++ b/thesis/vkr_final/Речь_к_защите_Байханов_2026.docx
@@ -540,7 +540,7 @@
           <w:color w:val="6B7280"/>
           <w:sz w:val="20"/>
         </w:rPr>
-        <w:t xml:space="preserve">  [~35 сек]</w:t>
+        <w:t xml:space="preserve">  [~38 сек]</w:t>
       </w:r>
     </w:p>
     <w:p>
@@ -550,7 +550,7 @@
         <w:jc w:val="both"/>
       </w:pPr>
       <w:r>
-        <w:t>Важный вопрос — будет ли модель работать в других портах, а не только там, где она обучалась. Я проверил её на двух новых портах без дополнительного обучения. В Варандее точность осталась высокой — ноль целых восемьдесят четыре; в Сабетте снизилась до ноль целых семьдесят шесть. Снижение закономерно: чем дальше порт, тем больше непривычных для модели типов льда. Вывод: подход рабочий, а для самых тяжёлых ледовых условий нужно небольшое дообучение на местных данных.</w:t>
+        <w:t>На этом слайде — три дополнительных порта, где модель проверялась без дообучения. По нефтяным разливам: Варандей дал F1 ноль целых восемьдесят четыре, Сабетта — ноль целых семьдесят шесть. Чем дальше от Кольского залива и сложнее ледовая обстановка — тем ниже точность, это закономерно. Третий порт — Печенга: там подтверждённых разливов вообще нет. Все тёмные пятна — ложные цели. Модель их правильно не засчитала как нефть. На трёх следующих слайдах разберу каждый порт подробно.</w:t>
       </w:r>
     </w:p>
     <w:p>
@@ -565,7 +565,7 @@
           <w:color w:val="B5331F"/>
           <w:sz w:val="26"/>
         </w:rPr>
-        <w:t>Разберу конкретные ложные цели в каждом из портов — начну с Печенги.</w:t>
+        <w:t>Начну с Печенги — самый безлёдный, там другие обманщики.</w:t>
       </w:r>
     </w:p>
     <w:p>
@@ -1025,7 +1025,7 @@
         <w:rPr>
           <w:sz w:val="24"/>
         </w:rPr>
-        <w:t>~35 сек</w:t>
+        <w:t>~38 сек</w:t>
       </w:r>
     </w:p>
     <w:p>

</xml_diff>

<commit_message>
speech: trim to ~7 min (831 words), fix grammar, honest timing
Сократил произносимый текст с 1038 до 831 слов (~7 мин при 120 сл/мин,
запас до 10 мин). Убрал воду, сохранил все цифры и плавные переходы.
Исправил "создан программа-прототип" → "создан программный прототип".
Хронометраж в документе приведён к реальному. Слайд 6: явно назван
источник MKLab. Проверено: слайды 6 и 9 не выходят за край.

https://claude.ai/code/session_019hNMUj3P61dTB8aYHXMjHP
</commit_message>
<xml_diff>
--- a/thesis/vkr_final/Речь_к_защите_Байханов_2026.docx
+++ b/thesis/vkr_final/Речь_к_защите_Байханов_2026.docx
@@ -104,7 +104,7 @@
           <w:color w:val="6B7280"/>
           <w:sz w:val="20"/>
         </w:rPr>
-        <w:t xml:space="preserve">  [~60 сек]</w:t>
+        <w:t xml:space="preserve">  [~50 сек]</w:t>
       </w:r>
     </w:p>
     <w:p>
@@ -114,7 +114,7 @@
         <w:jc w:val="both"/>
       </w:pPr>
       <w:r>
-        <w:t>Нефтяное загрязнение — одна из главных угроз экосистемам Арктики. Ежегодно в Мировой океан попадает более семисот тысяч тонн углеводородов, причём доля Арктики устойчиво растёт из-за расширения судоходства по Северному морскому пути. В холодных водах нефть разлагается в пять–десять раз медленнее, что приводит к долговременному ущербу. Более восьмидесяти процентов времени над портами — облачность и полярная ночь, поэтому единственный всепогодный инструмент — радиолокационная съёмка Sentinel-1.</w:t>
+        <w:t>Нефтяное загрязнение — одна из главных угроз Арктике. Ежегодно в океан попадает более семисот тысяч тонн углеводородов, и доля Арктики растёт из-за судоходства по Севморпути. В холодной воде нефть разлагается в пять–десять раз медленнее. А оптические спутники бесполезны: более восьмидесяти процентов времени — облачность и полярная ночь. Поэтому единственный всепогодный инструмент — радар Sentinel-1.</w:t>
       </w:r>
     </w:p>
     <w:p>
@@ -124,7 +124,7 @@
         <w:jc w:val="both"/>
       </w:pPr>
       <w:r>
-        <w:t>Но у радиолокации есть принципиальное ограничение. На радарном снимке нефтяная плёнка выглядит как тёмное пятно — однако точно такие же тёмные пятна дают молодой лёд, биогенные плёнки и зоны штиля. Из-за этих ложных целей классические пороговые методы дают до семидесяти процентов ложных срабатываний. Наглядный пример — внизу слайда: реальный, подтверждённый разлив мазута при бункеровке танкера в Кольском заливе одиннадцатого августа две тысячи двадцать четвёртого года. Это временной ряд реальных снимков Sentinel-1: хорошо видно, как пятно появляется в дни разлива и затем исчезает, и как модель его выделяет. Залив в это время был свободен ото льда. Именно этот случай и стал отправной точкой моей работы. Чтобы надёжно отличать нефть от её ледовых двойников, нужна не бинарная, а трёхклассовая нейросетевая модель — её разработке и посвящена работа.</w:t>
+        <w:t>Но у радара есть ловушка: нефть выглядит как тёмное пятно, и точно такие же пятна дают молодой лёд, плёнки водорослей и штиль. Из-за этого классические методы дают до семидесяти процентов ложных тревог. Пример — внизу слайда: реальный разлив мазута в Кольском заливе одиннадцатого августа две тысячи двадцать четвёртого года. Это ряд снимков Sentinel-1: видно, как пятно появляется в день разлива и исчезает, и как модель его выделяет. Чтобы надёжно отличать нефть от ледовых двойников, нужна не бинарная, а трёхклассовая модель — ей и посвящена работа.</w:t>
       </w:r>
     </w:p>
     <w:p>
@@ -139,7 +139,7 @@
           <w:color w:val="B5331F"/>
           <w:sz w:val="26"/>
         </w:rPr>
-        <w:t>Сформулированная проблема определила цель и задачи работы.</w:t>
+        <w:t>Эта проблема определила цель и задачи.</w:t>
       </w:r>
     </w:p>
     <w:p>
@@ -172,7 +172,7 @@
           <w:color w:val="6B7280"/>
           <w:sz w:val="20"/>
         </w:rPr>
-        <w:t xml:space="preserve">  [~35 сек]</w:t>
+        <w:t xml:space="preserve">  [~30 сек]</w:t>
       </w:r>
     </w:p>
     <w:p>
@@ -182,7 +182,7 @@
         <w:jc w:val="both"/>
       </w:pPr>
       <w:r>
-        <w:t>Цель работы — автоматизировать обнаружение нефтяных разливов по снимкам Sentinel-1. Для этого нужна нейросетевая модель, которая делит снимок на три класса — вода, нефть и лёд с сушей — и обеспечивает точность обнаружения нефти, показатель F1, не ниже ноль целых восьмидесяти пяти. Для достижения цели поставлены четыре задачи: изучить недостатки существующих методов и обосновать выбор архитектуры; собрать и разметить данные и обучить модель; реализовать программу-прототип; и оценить качество на реальных данных.</w:t>
+        <w:t>Цель — автоматизировать обнаружение нефтяных разливов по снимкам Sentinel-1. Для этого нужна модель, которая делит снимок на три класса — вода, нефть и лёд с сушей — и даёт точность обнаружения нефти, метрику F1, не ниже ноль целых восьмидесяти пяти. Отсюда четыре задачи: разобрать недостатки существующих методов; собрать данные и обучить модель; сделать программу-прототип; и оценить качество на реальных данных.</w:t>
       </w:r>
     </w:p>
     <w:p>
@@ -197,7 +197,7 @@
           <w:color w:val="B5331F"/>
           <w:sz w:val="26"/>
         </w:rPr>
-        <w:t>Чтобы обосновать выбор архитектуры, я сначала проанализировал существующие методы.</w:t>
+        <w:t>Сначала — что не так с существующими методами.</w:t>
       </w:r>
     </w:p>
     <w:p>
@@ -230,7 +230,7 @@
           <w:color w:val="6B7280"/>
           <w:sz w:val="20"/>
         </w:rPr>
-        <w:t xml:space="preserve">  [~35 сек]</w:t>
+        <w:t xml:space="preserve">  [~30 сек]</w:t>
       </w:r>
     </w:p>
     <w:p>
@@ -240,7 +240,7 @@
         <w:jc w:val="both"/>
       </w:pPr>
       <w:r>
-        <w:t>На слайде — таблица существующих подходов. Здесь и классический пороговый метод Оцу, и нейросети, например U-Net, и метод, анализирующий текстуру снимка, — в таблице он обозначен как GLCM плюс CNN. У всех у них один общий недостаток: они работают по схеме «нефть или не нефть» и не выделяют лёд в отдельный класс. Именно из-за этого в Арктике они дают до семидесяти процентов ложных тревог. Моя работа — нижняя строка таблицы — единственная, где есть сразу и три класса, и учёт ледовых ложных целей, и работа именно с арктическими данными.</w:t>
+        <w:t>В таблице — основные подходы: пороговый метод Оцу, нейросети вроде U-Net и текстурный метод GLCM плюс CNN. У всех общий недостаток: схема «нефть или не нефть», лёд в отдельный класс не выделяется. Из-за этого в Арктике до семидесяти процентов ложных тревог. Моя работа — нижняя строка — единственная, где есть сразу три класса, учёт ледовых ложных целей и арктические данные.</w:t>
       </w:r>
     </w:p>
     <w:p>
@@ -255,7 +255,7 @@
           <w:color w:val="B5331F"/>
           <w:sz w:val="26"/>
         </w:rPr>
-        <w:t>Опираясь на эти выводы, я построил собственный конвейер обработки данных.</w:t>
+        <w:t>На этих выводах я построил свой конвейер обработки.</w:t>
       </w:r>
     </w:p>
     <w:p>
@@ -288,7 +288,7 @@
           <w:color w:val="6B7280"/>
           <w:sz w:val="20"/>
         </w:rPr>
-        <w:t xml:space="preserve">  [~30 сек]</w:t>
+        <w:t xml:space="preserve">  [~25 сек]</w:t>
       </w:r>
     </w:p>
     <w:p>
@@ -298,7 +298,7 @@
         <w:jc w:val="both"/>
       </w:pPr>
       <w:r>
-        <w:t>Вся система работает как конвейер из трёх этапов. Первый этап — подготовка снимка: очистка от помех и географическая привязка; всё выполняется в свободном комплексе ESA SNAP. Второй этап — сама нейросеть, она делит снимок на три класса. Третий этап — проверка найденных пятен по данным о погоде и о движении судов, чтобы отсеять ложные срабатывания. Полная обработка одного снимка занимает шестьдесят пять секунд.</w:t>
+        <w:t>Система — это конвейер из трёх этапов. Первый — подготовка снимка: очистка от помех и геопривязка в свободной программе ESA SNAP. Второй — нейросеть, она делит снимок на три класса. Третий — проверка найденных пятен по погоде и движению судов, чтобы отсеять ложные. Весь снимок обрабатывается за шестьдесят пять секунд.</w:t>
       </w:r>
     </w:p>
     <w:p>
@@ -313,7 +313,7 @@
           <w:color w:val="B5331F"/>
           <w:sz w:val="26"/>
         </w:rPr>
-        <w:t>Подробнее остановлюсь на подготовке данных, на которых обучалась модель.</w:t>
+        <w:t>Подробнее — про подготовку данных для обучения.</w:t>
       </w:r>
     </w:p>
     <w:p>
@@ -346,7 +346,7 @@
           <w:color w:val="6B7280"/>
           <w:sz w:val="20"/>
         </w:rPr>
-        <w:t xml:space="preserve">  [~45 сек]</w:t>
+        <w:t xml:space="preserve">  [~40 сек]</w:t>
       </w:r>
     </w:p>
     <w:p>
@@ -356,7 +356,7 @@
         <w:jc w:val="both"/>
       </w:pPr>
       <w:r>
-        <w:t>Слева на слайде — как готовится каждый снимок перед нейросетью: шесть стандартных шагов в свободном комплексе ESA SNAP — от уточнения орбиты и подавления шума до геопривязки к местности. Это типовой, воспроизводимый конвейер.</w:t>
+        <w:t>Слева — как готовится каждый снимок: шесть стандартных шагов в свободной программе ESA SNAP, от уточнения орбиты и подавления шума до геопривязки. Это типовой воспроизводимый конвейер.</w:t>
       </w:r>
     </w:p>
     <w:p>
@@ -366,7 +366,7 @@
         <w:jc w:val="both"/>
       </w:pPr>
       <w:r>
-        <w:t>Справа — про данные. Всего тысяча сто двадцать пять снимков. Тысяча сто двенадцать — открытый набор, я переразметил его под свою трёхклассовую схему; а тринадцать снимков Кольского залива, за период с лета двадцать третьего по осень двадцать четвёртого года, я собрал и разметил вручную сам — это самая ценная, арктическая часть данных. Главная сложность — перекос: нефть занимает менее двух с половиной процентов пикселей, поэтому я специально повысил её значимость при обучении.</w:t>
+        <w:t>Справа — данные. Всего тысяча сто двадцать пять снимков. Тысяча сто двенадцать — открытый научный набор MKLab, я переразметил его под свою трёхклассовую схему. Ещё тринадцать снимков Кольского залива за двадцать третий–двадцать четвёртый год я собрал и разметил сам — это самая ценная, арктическая часть. Главная сложность — перекос: нефть это меньше двух с половиной процентов пикселей, поэтому при обучении я повысил её вес.</w:t>
       </w:r>
     </w:p>
     <w:p>
@@ -381,7 +381,7 @@
           <w:color w:val="B5331F"/>
           <w:sz w:val="26"/>
         </w:rPr>
-        <w:t>Теперь посмотрим, какого качества удалось достичь.</w:t>
+        <w:t>Теперь — какого качества удалось достичь.</w:t>
       </w:r>
     </w:p>
     <w:p>
@@ -414,7 +414,7 @@
           <w:color w:val="6B7280"/>
           <w:sz w:val="20"/>
         </w:rPr>
-        <w:t xml:space="preserve">  [~40 сек]</w:t>
+        <w:t xml:space="preserve">  [~35 сек]</w:t>
       </w:r>
     </w:p>
     <w:p>
@@ -424,7 +424,7 @@
         <w:jc w:val="both"/>
       </w:pPr>
       <w:r>
-        <w:t>Перейдём к результатам. Главный показатель — точность обнаружения нефти, это метрика F1 — составил ноль целых восемьдесят девять при целевом уровне ноль целых восемьдесят пять. То есть цель работы достигнута. Общая точность модели — почти девяносто шесть процентов. Подробные цифры по всем классам и матрица ошибок представлены на слайде.</w:t>
+        <w:t>Главный показатель — точность обнаружения нефти, метрика F1 — составил ноль целых восемьдесят девять при целевых ноль целых восемьдесят пять. Цель достигнута. Общая точность — почти девяносто шесть процентов. Цифры по классам и матрица ошибок — на слайде.</w:t>
       </w:r>
     </w:p>
     <w:p>
@@ -434,7 +434,7 @@
         <w:jc w:val="both"/>
       </w:pPr>
       <w:r>
-        <w:t>Отмечу главное: основная — и при этом небольшая — ошибка возникает там, где модель путает нефть с молодым льдом. Это физически объяснимо: на радарном снимке они действительно очень похожи.</w:t>
+        <w:t>Главное про ошибки: основная и небольшая — там, где модель путает нефть с молодым льдом. Это объяснимо: на радаре они действительно похожи.</w:t>
       </w:r>
     </w:p>
     <w:p>
@@ -449,7 +449,7 @@
           <w:color w:val="B5331F"/>
           <w:sz w:val="26"/>
         </w:rPr>
-        <w:t>Чтобы оценить эти результаты объективно, сравню их с известными аналогами.</w:t>
+        <w:t>Чтобы оценить это объективно — сравнение с аналогами.</w:t>
       </w:r>
     </w:p>
     <w:p>
@@ -482,7 +482,7 @@
           <w:color w:val="6B7280"/>
           <w:sz w:val="20"/>
         </w:rPr>
-        <w:t xml:space="preserve">  [~30 сек]</w:t>
+        <w:t xml:space="preserve">  [~25 сек]</w:t>
       </w:r>
     </w:p>
     <w:p>
@@ -492,7 +492,7 @@
         <w:jc w:val="both"/>
       </w:pPr>
       <w:r>
-        <w:t>Чтобы показать, что результат действительно сильный, я сравнил свою модель с четырьмя другими методами на одних и тех же данных. Сравнение приведено на слайде. По всем показателям моя модель оказалась лучше: ближайший конкурент дал ноль целых восемьдесят шесть, а моя модель — ноль целых восемьдесят девять. Главная причина выигрыша — именно трёхклассовая схема с отдельным классом льда.</w:t>
+        <w:t>Я сравнил модель с четырьмя другими методами на одних данных. По всем показателям моя оказалась лучше: ближайший конкурент — ноль целых восемьдесят шесть, моя — ноль целых восемьдесят девять. Причина выигрыша — трёхклассовая схема с отдельным классом льда.</w:t>
       </w:r>
     </w:p>
     <w:p>
@@ -507,7 +507,7 @@
           <w:color w:val="B5331F"/>
           <w:sz w:val="26"/>
         </w:rPr>
-        <w:t>Закономерно встаёт вопрос — насколько модель переносима на другие порты.</w:t>
+        <w:t>Дальше — насколько модель переносима на другие порты.</w:t>
       </w:r>
     </w:p>
     <w:p>
@@ -540,7 +540,7 @@
           <w:color w:val="6B7280"/>
           <w:sz w:val="20"/>
         </w:rPr>
-        <w:t xml:space="preserve">  [~38 сек]</w:t>
+        <w:t xml:space="preserve">  [~32 сек]</w:t>
       </w:r>
     </w:p>
     <w:p>
@@ -550,7 +550,7 @@
         <w:jc w:val="both"/>
       </w:pPr>
       <w:r>
-        <w:t>На этом слайде — три дополнительных порта, где модель проверялась без дообучения. По нефтяным разливам: Варандей дал F1 ноль целых восемьдесят четыре, Сабетта — ноль целых семьдесят шесть. Чем дальше от Кольского залива и сложнее ледовая обстановка — тем ниже точность, это закономерно. Третий порт — Печенга: там подтверждённых разливов вообще нет. Все тёмные пятна — ложные цели. Модель их правильно не засчитала как нефть. На трёх следующих слайдах разберу каждый порт подробно.</w:t>
+        <w:t>Я проверил модель на трёх других портах без дообучения. По нефти: Варандей дал F1 ноль целых восемьдесят четыре, Сабетта — ноль целых семьдесят шесть. Чем дальше от Кольского залива и сложнее лёд, тем ниже точность — это закономерно. Третий порт, Печенга, — особый: разливов там нет, все тёмные пятна это ложные цели, и модель верно не приняла их за нефть. Дальше разберу каждый порт по одному слайду.</w:t>
       </w:r>
     </w:p>
     <w:p>
@@ -565,7 +565,7 @@
           <w:color w:val="B5331F"/>
           <w:sz w:val="26"/>
         </w:rPr>
-        <w:t>Начну с Печенги — самый безлёдный, там другие обманщики.</w:t>
+        <w:t>Начну с Печенги — там лёд почти отсутствует.</w:t>
       </w:r>
     </w:p>
     <w:p>
@@ -598,7 +598,7 @@
           <w:color w:val="6B7280"/>
           <w:sz w:val="20"/>
         </w:rPr>
-        <w:t xml:space="preserve">  [~18 сек]</w:t>
+        <w:t xml:space="preserve">  [~15 сек]</w:t>
       </w:r>
     </w:p>
     <w:p>
@@ -608,7 +608,7 @@
         <w:jc w:val="both"/>
       </w:pPr>
       <w:r>
-        <w:t>Порт Печенга, Баренцево море — льда здесь почти нет. На снимке показаны два главных «обманщика» радара: тёмные пятна от затишья ветра и плёнки от водорослей. Модель правильно распознала их как не-нефть и не подняла ложную тревогу.</w:t>
+        <w:t>Печенга, Баренцево море — льда почти нет. На снимке два главных обманщика радара: тёмные пятна от штиля и плёнки от водорослей. Модель распознала их как не-нефть и не подняла ложную тревогу.</w:t>
       </w:r>
     </w:p>
     <w:p>
@@ -623,7 +623,7 @@
           <w:color w:val="B5331F"/>
           <w:sz w:val="26"/>
         </w:rPr>
-        <w:t>Переходим севернее — терминал Варандей, где главная сложность уже ледовая.</w:t>
+        <w:t>Севернее — терминал Варандей, там сложность уже ледовая.</w:t>
       </w:r>
     </w:p>
     <w:p>
@@ -656,7 +656,7 @@
           <w:color w:val="6B7280"/>
           <w:sz w:val="20"/>
         </w:rPr>
-        <w:t xml:space="preserve">  [~18 сек]</w:t>
+        <w:t xml:space="preserve">  [~15 сек]</w:t>
       </w:r>
     </w:p>
     <w:p>
@@ -666,7 +666,7 @@
         <w:jc w:val="both"/>
       </w:pPr>
       <w:r>
-        <w:t>Терминал Варандей, Печорское море. Здесь главная трудность — дрейфующий молодой лёд. Обычный, бинарный метод принял бы его за нефть. На снимке видно, как трёхклассовая модель чётко отделяет лёд от возможного нефтяного пятна.</w:t>
+        <w:t>Варандей, Печорское море. Главная трудность — дрейфующий молодой лёд. Бинарный метод принял бы его за нефть, а трёхклассовая модель чётко отделяет лёд от возможного нефтяного пятна.</w:t>
       </w:r>
     </w:p>
     <w:p>
@@ -681,7 +681,7 @@
           <w:color w:val="B5331F"/>
           <w:sz w:val="26"/>
         </w:rPr>
-        <w:t>И самый трудный случай — порт Сабетта в Карском море.</w:t>
+        <w:t>И самый трудный случай — Сабетта в Карском море.</w:t>
       </w:r>
     </w:p>
     <w:p>
@@ -714,7 +714,7 @@
           <w:color w:val="6B7280"/>
           <w:sz w:val="20"/>
         </w:rPr>
-        <w:t xml:space="preserve">  [~18 сек]</w:t>
+        <w:t xml:space="preserve">  [~15 сек]</w:t>
       </w:r>
     </w:p>
     <w:p>
@@ -724,7 +724,7 @@
         <w:jc w:val="both"/>
       </w:pPr>
       <w:r>
-        <w:t>Порт Сабетта, Карское море — самая сложная акватория. Здесь молодой жировой и ниласовый лёд, припай — это редкие типы льда, которых почти не было в обучающих данных. Поэтому здесь точность ниже — ноль целых семьдесят шесть. На снимке видно, где модель работает уверенно, а где возникают сложности.</w:t>
+        <w:t>Сабетта, Карское море — самая сложная акватория. Здесь жировой и ниласовый лёд, припай — редкие типы, которых почти не было в обучении. Поэтому точность ниже, ноль целых семьдесят шесть. На снимке видно, где модель уверенна, а где возникают сложности.</w:t>
       </w:r>
     </w:p>
     <w:p>
@@ -739,7 +739,7 @@
           <w:color w:val="B5331F"/>
           <w:sz w:val="26"/>
         </w:rPr>
-        <w:t>Перейду к итогам работы.</w:t>
+        <w:t>Перейду к итогам.</w:t>
       </w:r>
     </w:p>
     <w:p>
@@ -772,7 +772,7 @@
           <w:color w:val="6B7280"/>
           <w:sz w:val="20"/>
         </w:rPr>
-        <w:t xml:space="preserve">  [~45 сек]</w:t>
+        <w:t xml:space="preserve">  [~35 сек]</w:t>
       </w:r>
     </w:p>
     <w:p>
@@ -782,7 +782,7 @@
         <w:jc w:val="both"/>
       </w:pPr>
       <w:r>
-        <w:t>Подведу итог. Цель работы достигнута: точность обнаружения нефти — ноль целых восемьдесят девять при требуемых ноль целых восемьдесят пять. Все четыре задачи решены: разобраны недостатки существующих методов и обоснован выбор модели; собран и размечен датасет; создан программа-прототип, обрабатывающий снимок за минуту; и на реальных данных доказано, что модель точнее аналогов и переносима на другие арктические порты.</w:t>
+        <w:t>Подведу итог. Цель достигнута: точность обнаружения нефти — ноль целых восемьдесят девять при требуемых ноль целых восемьдесят пять. Все четыре задачи решены: разобраны недостатки методов и обоснован выбор модели; собран и размечен датасет; создан прототип, обрабатывающий снимок за минуту; и доказано, что модель точнее аналогов и переносима на другие арктические порты.</w:t>
       </w:r>
     </w:p>
     <w:p>
@@ -792,7 +792,7 @@
         <w:jc w:val="both"/>
       </w:pPr>
       <w:r>
-        <w:t>Практическая значимость в том, что прототип можно применять для экологического мониторинга арктических портов — в интересах Росприроднадзора, МЧС России, Морспасслужбы и контроля Северного морского пути.</w:t>
+        <w:t>Практическая значимость: прототип применим для экологического мониторинга арктических портов — в интересах Росприроднадзора, МЧС, Морспасслужбы и контроля Северного морского пути.</w:t>
       </w:r>
     </w:p>
     <w:p>
@@ -807,7 +807,7 @@
           <w:color w:val="B5331F"/>
           <w:sz w:val="26"/>
         </w:rPr>
-        <w:t>На этом доклад окончен. Благодарю за внимание.</w:t>
+        <w:t>Доклад окончен. Благодарю за внимание.</w:t>
       </w:r>
     </w:p>
     <w:p>
@@ -899,7 +899,7 @@
         <w:rPr>
           <w:sz w:val="24"/>
         </w:rPr>
-        <w:t>~60 сек</w:t>
+        <w:t>~50 сек</w:t>
       </w:r>
     </w:p>
     <w:p>
@@ -917,7 +917,7 @@
         <w:rPr>
           <w:sz w:val="24"/>
         </w:rPr>
-        <w:t>~35 сек</w:t>
+        <w:t>~30 сек</w:t>
       </w:r>
     </w:p>
     <w:p>
@@ -935,7 +935,7 @@
         <w:rPr>
           <w:sz w:val="24"/>
         </w:rPr>
-        <w:t>~35 сек</w:t>
+        <w:t>~30 сек</w:t>
       </w:r>
     </w:p>
     <w:p>
@@ -953,7 +953,7 @@
         <w:rPr>
           <w:sz w:val="24"/>
         </w:rPr>
-        <w:t>~30 сек</w:t>
+        <w:t>~25 сек</w:t>
       </w:r>
     </w:p>
     <w:p>
@@ -971,7 +971,7 @@
         <w:rPr>
           <w:sz w:val="24"/>
         </w:rPr>
-        <w:t>~45 сек</w:t>
+        <w:t>~40 сек</w:t>
       </w:r>
     </w:p>
     <w:p>
@@ -989,7 +989,7 @@
         <w:rPr>
           <w:sz w:val="24"/>
         </w:rPr>
-        <w:t>~40 сек</w:t>
+        <w:t>~35 сек</w:t>
       </w:r>
     </w:p>
     <w:p>
@@ -1007,7 +1007,7 @@
         <w:rPr>
           <w:sz w:val="24"/>
         </w:rPr>
-        <w:t>~30 сек</w:t>
+        <w:t>~25 сек</w:t>
       </w:r>
     </w:p>
     <w:p>
@@ -1025,7 +1025,7 @@
         <w:rPr>
           <w:sz w:val="24"/>
         </w:rPr>
-        <w:t>~38 сек</w:t>
+        <w:t>~32 сек</w:t>
       </w:r>
     </w:p>
     <w:p>
@@ -1043,7 +1043,7 @@
         <w:rPr>
           <w:sz w:val="24"/>
         </w:rPr>
-        <w:t>~18 сек</w:t>
+        <w:t>~15 сек</w:t>
       </w:r>
     </w:p>
     <w:p>
@@ -1061,7 +1061,7 @@
         <w:rPr>
           <w:sz w:val="24"/>
         </w:rPr>
-        <w:t>~18 сек</w:t>
+        <w:t>~15 сек</w:t>
       </w:r>
     </w:p>
     <w:p>
@@ -1079,7 +1079,7 @@
         <w:rPr>
           <w:sz w:val="24"/>
         </w:rPr>
-        <w:t>~18 сек</w:t>
+        <w:t>~15 сек</w:t>
       </w:r>
     </w:p>
     <w:p>
@@ -1097,7 +1097,7 @@
         <w:rPr>
           <w:sz w:val="24"/>
         </w:rPr>
-        <w:t>~45 сек</w:t>
+        <w:t>~35 сек</w:t>
       </w:r>
     </w:p>
     <w:p>
@@ -1133,7 +1133,7 @@
         <w:rPr>
           <w:sz w:val="24"/>
         </w:rPr>
-        <w:t>~7 мин 35 сек  (запас ~2 мин 25 сек)</w:t>
+        <w:t>~7 мин (при темпе 120 сл/мин); запас до 10 мин</w:t>
       </w:r>
     </w:p>
     <w:p/>

</xml_diff>

<commit_message>
final: redesign slide 13, cite ASF DAAC source, fix port wording
Презентация:
- Слайд 13 (Заключение): переработан — плашка «цель достигнута», 4 задачи
  с галочками, две карточки «Научная новизна» | «Практическая значимость».
  Метрики со слайда 7 НЕ дублируются.
- Слайды 10–12: добавлена ссылка на источник снимков
  (Sentinel-1 / ASF DAAC / earthdata.nasa.gov, предобработка ESA SNAP).

Речь:
- Слайды 10–12: формулировки приведены в соответствие с тем, что реально
  показано на снимках (тёмные зоны = ловушка порогового метода), без
  переоценки как «выход нейросети». Тайминг ~7 мин (842 слова).

Q&A:
- qa(7): добавлено происхождение снимков (ASF DAAC, ESA SNAP).

Проверено: слайды 10–13 не выходят за край; числа совпадают в 3 файлах.

https://claude.ai/code/session_019hNMUj3P61dTB8aYHXMjHP
</commit_message>
<xml_diff>
--- a/thesis/vkr_final/Речь_к_защите_Байханов_2026.docx
+++ b/thesis/vkr_final/Речь_к_защите_Байханов_2026.docx
@@ -608,7 +608,7 @@
         <w:jc w:val="both"/>
       </w:pPr>
       <w:r>
-        <w:t>Печенга, Баренцево море — льда почти нет. На снимке два главных обманщика радара: тёмные пятна от штиля и плёнки от водорослей. Модель распознала их как не-нефть и не подняла ложную тревогу.</w:t>
+        <w:t>Печенга, Баренцево море — льда почти нет. На реальном снимке Sentinel-1 два главных обманщика радара: тёмные пятна от штиля и плёнки от водорослей. Для порогового метода это ложные тревоги — а наша трёхклассовая модель учится отличать их от нефти.</w:t>
       </w:r>
     </w:p>
     <w:p>
@@ -666,7 +666,7 @@
         <w:jc w:val="both"/>
       </w:pPr>
       <w:r>
-        <w:t>Варандей, Печорское море. Главная трудность — дрейфующий молодой лёд. Бинарный метод принял бы его за нефть, а трёхклассовая модель чётко отделяет лёд от возможного нефтяного пятна.</w:t>
+        <w:t>Варандей, Печорское море. Главная трудность — дрейфующий молодой лёд: на радаре он тёмный, и бинарный метод принял бы его за нефть. Отдельный класс льда в нашей модели как раз снимает эту ошибку.</w:t>
       </w:r>
     </w:p>
     <w:p>
@@ -724,7 +724,7 @@
         <w:jc w:val="both"/>
       </w:pPr>
       <w:r>
-        <w:t>Сабетта, Карское море — самая сложная акватория. Здесь жировой и ниласовый лёд, припай — редкие типы, которых почти не было в обучении. Поэтому точность ниже, ноль целых семьдесят шесть. На снимке видно, где модель уверенна, а где возникают сложности.</w:t>
+        <w:t>Сабетта, Карское море — самая сложная акватория: жировой и ниласовый лёд, припай. Этих редких типов почти не было в обучении, поэтому здесь точность ниже — ноль целых семьдесят шесть. На снимке видно, какие тёмные зоны создают трудность.</w:t>
       </w:r>
     </w:p>
     <w:p>

</xml_diff>